<commit_message>
Remove capstone D833 line from certifications and resume assets
</commit_message>
<xml_diff>
--- a/tools/Paul-Romeo-Resume.docx
+++ b/tools/Paul-Romeo-Resume.docx
@@ -374,15 +374,6 @@
         <w:t xml:space="preserve"> — Western Governors University, August 2026</w:t>
       </w:r>
     </w:p>
-    <w:p>
-      <w:pPr>
-        <w:pStyle w:val="JobMeta"/>
-        <w:spacing w:before="0" w:after="0" w:line="240" w:lineRule="auto"/>
-      </w:pPr>
-      <w:r>
-        <w:t>Capstone (D833): Wazuh SIEM deployment + Duo MFA proposal — passed on first submission.</w:t>
-      </w:r>
-    </w:p>
     <w:sectPr>
       <w:pgSz w:w="12240" w:h="15840"/>
       <w:pgMar w:top="720" w:right="799" w:bottom="720" w:left="799" w:header="720" w:footer="720" w:gutter="0"/>

</xml_diff>

<commit_message>
Add Projects section (OSINT Fraud Network Investigation) to resume
</commit_message>
<xml_diff>
--- a/tools/Paul-Romeo-Resume.docx
+++ b/tools/Paul-Romeo-Resume.docx
@@ -353,6 +353,48 @@
     <w:p>
       <w:pPr>
         <w:pStyle w:val="SectionHeader"/>
+      </w:pPr>
+      <w:r>
+        <w:t>PROJECTS</w:t>
+      </w:r>
+    </w:p>
+    <w:p>
+      <w:r>
+        <w:t>OSINT Fraud Network Investigation — Independent</w:t>
+      </w:r>
+    </w:p>
+    <w:p>
+      <w:r>
+        <w:t>September 2026</w:t>
+      </w:r>
+    </w:p>
+    <w:p>
+      <w:pPr>
+        <w:pStyle w:val="ListBullet"/>
+      </w:pPr>
+      <w:r>
+        <w:t>Identified and dismantled a network of 15 fraudulent websites and 5 payment processors impersonating real small businesses.</w:t>
+      </w:r>
+    </w:p>
+    <w:p>
+      <w:pPr>
+        <w:pStyle w:val="ListBullet"/>
+      </w:pPr>
+      <w:r>
+        <w:t>Traced the full operation to a single threat actor using WHOIS data, Burp Suite, DNS analysis, and a shared admin handle found in page source.</w:t>
+      </w:r>
+    </w:p>
+    <w:p>
+      <w:pPr>
+        <w:pStyle w:val="ListBullet"/>
+      </w:pPr>
+      <w:r>
+        <w:t>Filed coordinated takedowns that took down the entire operation.</w:t>
+      </w:r>
+    </w:p>
+    <w:p>
+      <w:pPr>
+        <w:pStyle w:val="SectionHeader"/>
         <w:spacing w:before="0" w:after="0" w:line="240" w:lineRule="auto"/>
       </w:pPr>
       <w:r>

</xml_diff>

<commit_message>
Compact DOCX resume metrics so it renders on one page
</commit_message>
<xml_diff>
--- a/tools/Paul-Romeo-Resume.docx
+++ b/tools/Paul-Romeo-Resume.docx
@@ -5,420 +5,573 @@
     <w:p>
       <w:pPr>
         <w:pStyle w:val="NameTitle"/>
-        <w:spacing w:before="0" w:after="0" w:line="240" w:lineRule="auto"/>
+        <w:spacing w:before="0" w:after="40" w:line="240" w:lineRule="auto"/>
       </w:pPr>
       <w:r>
+        <w:rPr>
+          <w:sz w:val="36"/>
+        </w:rPr>
         <w:t>PAUL J. ROMEO</w:t>
       </w:r>
     </w:p>
     <w:p>
       <w:pPr>
         <w:pStyle w:val="ContactLine"/>
-        <w:spacing w:before="0" w:after="0" w:line="240" w:lineRule="auto"/>
+        <w:spacing w:before="0" w:after="40" w:line="230" w:lineRule="exact"/>
       </w:pPr>
       <w:r>
+        <w:rPr>
+          <w:sz w:val="19"/>
+        </w:rPr>
         <w:t>Union, NJ  |  pauljromeo@proton.me  |  linkedin.com/in/paul-romeo  |  github.com/p-romeo</w:t>
       </w:r>
     </w:p>
     <w:p>
       <w:pPr>
         <w:pStyle w:val="SectionHeader"/>
-        <w:spacing w:before="0" w:after="0" w:line="240" w:lineRule="auto"/>
+        <w:spacing w:before="120" w:after="40" w:line="260" w:lineRule="exact"/>
       </w:pPr>
       <w:r>
+        <w:rPr>
+          <w:sz w:val="22"/>
+        </w:rPr>
         <w:t>SUMMARY</w:t>
       </w:r>
     </w:p>
     <w:p>
       <w:pPr>
         <w:pStyle w:val="Body"/>
-        <w:spacing w:before="0" w:after="0" w:line="240" w:lineRule="auto"/>
+        <w:spacing w:before="0" w:after="40" w:line="230" w:lineRule="exact"/>
       </w:pPr>
       <w:r>
+        <w:rPr>
+          <w:sz w:val="19"/>
+        </w:rPr>
         <w:t>Security-focused IT professional who owns security and IT operations end-to-end for a multi-channel e-commerce company. Leads incident response and phishing/BEC investigations through to attacker-infrastructure takedowns; administers ESET EDR, UniFi networking and Protect surveillance, and TrueNAS storage. B.S. in Cybersecurity &amp; Information Assurance (WGU, August 2026) backed by nine industry certifications including Security+, CySA+, PenTest+, and ISC2 SSCP.</w:t>
       </w:r>
     </w:p>
     <w:p>
       <w:pPr>
         <w:pStyle w:val="SectionHeader"/>
-        <w:spacing w:before="0" w:after="0" w:line="240" w:lineRule="auto"/>
+        <w:spacing w:before="120" w:after="40" w:line="260" w:lineRule="exact"/>
       </w:pPr>
       <w:r>
+        <w:rPr>
+          <w:sz w:val="22"/>
+        </w:rPr>
         <w:t>CORE SKILLS</w:t>
       </w:r>
     </w:p>
     <w:p>
       <w:pPr>
         <w:pStyle w:val="Body"/>
-        <w:spacing w:before="0" w:after="0" w:line="240" w:lineRule="auto"/>
+        <w:spacing w:before="0" w:after="40" w:line="230" w:lineRule="exact"/>
       </w:pPr>
       <w:r>
         <w:rPr>
           <w:b/>
+          <w:sz w:val="19"/>
         </w:rPr>
         <w:t xml:space="preserve">Security Operations: </w:t>
       </w:r>
       <w:r>
+        <w:rPr>
+          <w:sz w:val="19"/>
+        </w:rPr>
         <w:t>EDR Administration (ESET EDR / Cloud Protect) | Phishing &amp; BEC Investigation | Attacker-Infrastructure Takedowns | Log Analysis | Wazuh SIEM | Duo MFA | Vulnerability Management | Endpoint Hardening | Patch Management</w:t>
       </w:r>
     </w:p>
     <w:p>
       <w:pPr>
         <w:pStyle w:val="Body"/>
-        <w:spacing w:before="0" w:after="0" w:line="240" w:lineRule="auto"/>
+        <w:spacing w:before="0" w:after="40" w:line="230" w:lineRule="exact"/>
       </w:pPr>
       <w:r>
         <w:rPr>
           <w:b/>
+          <w:sz w:val="19"/>
         </w:rPr>
         <w:t xml:space="preserve">Network &amp; Infrastructure: </w:t>
       </w:r>
       <w:r>
+        <w:rPr>
+          <w:sz w:val="19"/>
+        </w:rPr>
         <w:t>UniFi Networking | VLANs &amp; Segmentation | TCP/IP, DNS, Wi-Fi | TrueNAS / SMB Storage | Backup &amp; Disaster Recovery | Windows &amp; Active Directory</w:t>
       </w:r>
     </w:p>
     <w:p>
       <w:pPr>
         <w:pStyle w:val="Body"/>
-        <w:spacing w:before="0" w:after="0" w:line="240" w:lineRule="auto"/>
+        <w:spacing w:before="0" w:after="40" w:line="230" w:lineRule="exact"/>
       </w:pPr>
       <w:r>
         <w:rPr>
           <w:b/>
+          <w:sz w:val="19"/>
         </w:rPr>
         <w:t xml:space="preserve">Automation &amp; Tools: </w:t>
       </w:r>
       <w:r>
+        <w:rPr>
+          <w:sz w:val="19"/>
+        </w:rPr>
         <w:t>Python | PowerShell | Bash | Git | GitHub Actions CI/CD</w:t>
       </w:r>
     </w:p>
     <w:p>
       <w:pPr>
         <w:pStyle w:val="Body"/>
-        <w:spacing w:before="0" w:after="0" w:line="240" w:lineRule="auto"/>
+        <w:spacing w:before="0" w:after="40" w:line="230" w:lineRule="exact"/>
       </w:pPr>
       <w:r>
         <w:rPr>
           <w:b/>
+          <w:sz w:val="19"/>
         </w:rPr>
         <w:t xml:space="preserve">Business Platforms: </w:t>
       </w:r>
       <w:r>
+        <w:rPr>
+          <w:sz w:val="19"/>
+        </w:rPr>
         <w:t>BigCommerce | Amazon FBA | eBay | POS Integration</w:t>
       </w:r>
     </w:p>
     <w:p>
       <w:pPr>
         <w:pStyle w:val="SectionHeader"/>
-        <w:spacing w:before="0" w:after="0" w:line="240" w:lineRule="auto"/>
+        <w:spacing w:before="120" w:after="40" w:line="260" w:lineRule="exact"/>
       </w:pPr>
       <w:r>
+        <w:rPr>
+          <w:sz w:val="22"/>
+        </w:rPr>
         <w:t>CERTIFICATIONS</w:t>
       </w:r>
     </w:p>
     <w:p>
       <w:pPr>
         <w:pStyle w:val="ListBullet"/>
-        <w:spacing w:before="0" w:after="0" w:line="240" w:lineRule="auto"/>
+        <w:spacing w:before="0" w:after="20" w:line="230" w:lineRule="exact"/>
       </w:pPr>
       <w:r>
+        <w:rPr>
+          <w:sz w:val="19"/>
+        </w:rPr>
         <w:t>CompTIA PenTest+ (PT0-003) — ID e3a26d1b0a1944db8e569cfa0ce20432 (Apr 2026 - Apr 2029)</w:t>
       </w:r>
     </w:p>
     <w:p>
       <w:pPr>
         <w:pStyle w:val="ListBullet"/>
-        <w:spacing w:before="0" w:after="0" w:line="240" w:lineRule="auto"/>
+        <w:spacing w:before="0" w:after="20" w:line="230" w:lineRule="exact"/>
       </w:pPr>
       <w:r>
+        <w:rPr>
+          <w:sz w:val="19"/>
+        </w:rPr>
         <w:t>CompTIA CySA+ — ID RWEXWLLS9NRE5JE2 (Aug 2025 - Aug 2028)</w:t>
       </w:r>
     </w:p>
     <w:p>
       <w:pPr>
         <w:pStyle w:val="ListBullet"/>
-        <w:spacing w:before="0" w:after="0" w:line="240" w:lineRule="auto"/>
+        <w:spacing w:before="0" w:after="20" w:line="230" w:lineRule="exact"/>
       </w:pPr>
       <w:r>
+        <w:rPr>
+          <w:sz w:val="19"/>
+        </w:rPr>
         <w:t>ISC2 SSCP — ID 1123939 (Jul 2025)</w:t>
       </w:r>
     </w:p>
     <w:p>
       <w:pPr>
         <w:pStyle w:val="ListBullet"/>
-        <w:spacing w:before="0" w:after="0" w:line="240" w:lineRule="auto"/>
+        <w:spacing w:before="0" w:after="20" w:line="230" w:lineRule="exact"/>
       </w:pPr>
       <w:r>
+        <w:rPr>
+          <w:sz w:val="19"/>
+        </w:rPr>
         <w:t>CompTIA Project+ — ID K1MYZLGS02V415QJ (Jul 2025)</w:t>
       </w:r>
     </w:p>
     <w:p>
       <w:pPr>
         <w:pStyle w:val="ListBullet"/>
-        <w:spacing w:before="0" w:after="0" w:line="240" w:lineRule="auto"/>
+        <w:spacing w:before="0" w:after="20" w:line="230" w:lineRule="exact"/>
       </w:pPr>
       <w:r>
+        <w:rPr>
+          <w:sz w:val="19"/>
+        </w:rPr>
         <w:t>LPI Linux Essentials — ID LPI000661841 (Aug 2025)</w:t>
       </w:r>
     </w:p>
     <w:p>
       <w:pPr>
         <w:pStyle w:val="ListBullet"/>
-        <w:spacing w:before="0" w:after="0" w:line="240" w:lineRule="auto"/>
+        <w:spacing w:before="0" w:after="20" w:line="230" w:lineRule="exact"/>
       </w:pPr>
       <w:r>
+        <w:rPr>
+          <w:sz w:val="19"/>
+        </w:rPr>
         <w:t>CompTIA Security+ — ID 2SY3TK06GJ44Q4WQ (Jul 2024 - Jul 2027)</w:t>
       </w:r>
     </w:p>
     <w:p>
       <w:pPr>
         <w:pStyle w:val="ListBullet"/>
-        <w:spacing w:before="0" w:after="0" w:line="240" w:lineRule="auto"/>
+        <w:spacing w:before="0" w:after="20" w:line="230" w:lineRule="exact"/>
       </w:pPr>
       <w:r>
+        <w:rPr>
+          <w:sz w:val="19"/>
+        </w:rPr>
         <w:t>CompTIA Network+ — ID N0BPXTXZFFV4QM3T (Jun 2024 - Jun 2027)</w:t>
       </w:r>
     </w:p>
     <w:p>
       <w:pPr>
         <w:pStyle w:val="ListBullet"/>
-        <w:spacing w:before="0" w:after="0" w:line="240" w:lineRule="auto"/>
+        <w:spacing w:before="0" w:after="20" w:line="230" w:lineRule="exact"/>
       </w:pPr>
       <w:r>
+        <w:rPr>
+          <w:sz w:val="19"/>
+        </w:rPr>
         <w:t>CompTIA A+ — ID G33N7H5ZJERE1F5W (Jun 2024 - Jun 2027)</w:t>
       </w:r>
     </w:p>
     <w:p>
       <w:pPr>
         <w:pStyle w:val="ListBullet"/>
-        <w:spacing w:before="0" w:after="0" w:line="240" w:lineRule="auto"/>
+        <w:spacing w:before="0" w:after="20" w:line="230" w:lineRule="exact"/>
       </w:pPr>
       <w:r>
+        <w:rPr>
+          <w:sz w:val="19"/>
+        </w:rPr>
         <w:t>ITIL 4 Foundation — ID GR671719240PR (Dec 2024 - Dec 2027)</w:t>
       </w:r>
     </w:p>
     <w:p>
       <w:pPr>
         <w:pStyle w:val="SectionHeader"/>
-        <w:spacing w:before="0" w:after="0" w:line="240" w:lineRule="auto"/>
+        <w:spacing w:before="120" w:after="40" w:line="260" w:lineRule="exact"/>
       </w:pPr>
       <w:r>
+        <w:rPr>
+          <w:sz w:val="22"/>
+        </w:rPr>
         <w:t>PROFESSIONAL EXPERIENCE</w:t>
       </w:r>
     </w:p>
     <w:p>
       <w:pPr>
         <w:pStyle w:val="JobTitle"/>
-        <w:spacing w:before="0" w:after="0" w:line="240" w:lineRule="auto"/>
+        <w:spacing w:before="0" w:after="40" w:line="230" w:lineRule="exact"/>
       </w:pPr>
       <w:r>
+        <w:rPr>
+          <w:sz w:val="19"/>
+        </w:rPr>
         <w:t>Systems Administrator &amp; Security Administrator</w:t>
       </w:r>
       <w:r>
+        <w:rPr>
+          <w:sz w:val="19"/>
+        </w:rPr>
         <w:t xml:space="preserve"> — Belmont Leather Company</w:t>
       </w:r>
     </w:p>
     <w:p>
       <w:pPr>
         <w:pStyle w:val="JobMeta"/>
-        <w:spacing w:before="0" w:after="0" w:line="240" w:lineRule="auto"/>
+        <w:spacing w:before="0" w:after="40" w:line="230" w:lineRule="exact"/>
       </w:pPr>
       <w:r>
+        <w:rPr>
+          <w:sz w:val="19"/>
+        </w:rPr>
         <w:t>Clifton, NJ  |  2021 - Present</w:t>
       </w:r>
     </w:p>
     <w:p>
       <w:pPr>
         <w:pStyle w:val="ListBullet"/>
-        <w:spacing w:before="0" w:after="0" w:line="240" w:lineRule="auto"/>
+        <w:spacing w:before="0" w:after="20" w:line="230" w:lineRule="exact"/>
       </w:pPr>
       <w:r>
+        <w:rPr>
+          <w:sz w:val="19"/>
+        </w:rPr>
         <w:t>Own security and IT operations end-to-end as the company's sole internal administrator: workstations, printers, network devices, storage, and backups.</w:t>
       </w:r>
     </w:p>
     <w:p>
       <w:pPr>
         <w:pStyle w:val="ListBullet"/>
-        <w:spacing w:before="0" w:after="0" w:line="240" w:lineRule="auto"/>
+        <w:spacing w:before="0" w:after="20" w:line="230" w:lineRule="exact"/>
       </w:pPr>
       <w:r>
+        <w:rPr>
+          <w:sz w:val="19"/>
+        </w:rPr>
         <w:t>Administer ESET EDR and ESET Cloud Protect across ~15 endpoints; built automated threat alerting, weekly CVE exposure reviews, and endpoint update management.</w:t>
       </w:r>
     </w:p>
     <w:p>
       <w:pPr>
         <w:pStyle w:val="ListBullet"/>
-        <w:spacing w:before="0" w:after="0" w:line="240" w:lineRule="auto"/>
+        <w:spacing w:before="0" w:after="20" w:line="230" w:lineRule="exact"/>
       </w:pPr>
       <w:r>
+        <w:rPr>
+          <w:sz w:val="19"/>
+        </w:rPr>
         <w:t>Lead phishing and BEC incident response end-to-end, filing registrar/host/abuse-desk takedowns against live campaigns (ClickFix malware lures, BEC impersonation attempts, SSA/ScreenConnect lures, and brand-impersonation waves).</w:t>
       </w:r>
     </w:p>
     <w:p>
       <w:pPr>
         <w:pStyle w:val="ListBullet"/>
-        <w:spacing w:before="0" w:after="0" w:line="240" w:lineRule="auto"/>
+        <w:spacing w:before="0" w:after="20" w:line="230" w:lineRule="exact"/>
       </w:pPr>
       <w:r>
+        <w:rPr>
+          <w:sz w:val="19"/>
+        </w:rPr>
         <w:t>Designed and deployed core infrastructure: a UniFi network with VLAN segmentation, a 10-camera UniFi Protect surveillance system, and TrueNAS storage with SMB shares and scheduled cloud backup.</w:t>
       </w:r>
     </w:p>
     <w:p>
       <w:pPr>
         <w:pStyle w:val="ListBullet"/>
-        <w:spacing w:before="0" w:after="0" w:line="240" w:lineRule="auto"/>
+        <w:spacing w:before="0" w:after="20" w:line="230" w:lineRule="exact"/>
       </w:pPr>
       <w:r>
+        <w:rPr>
+          <w:sz w:val="19"/>
+        </w:rPr>
         <w:t>Drove e-commerce growth on BigCommerce integrated with point-of-sale: 389% sales growth and $1.2M in new revenue; cut $12K in costs through POS/e-commerce integration and added $32K/year via customer-relationship systems.</w:t>
       </w:r>
     </w:p>
     <w:p>
       <w:pPr>
         <w:pStyle w:val="JobTitle"/>
-        <w:spacing w:before="0" w:after="0" w:line="240" w:lineRule="auto"/>
+        <w:spacing w:before="0" w:after="40" w:line="230" w:lineRule="exact"/>
       </w:pPr>
       <w:r>
+        <w:rPr>
+          <w:sz w:val="19"/>
+        </w:rPr>
         <w:t>Theater Technician (Part-time)</w:t>
       </w:r>
       <w:r>
+        <w:rPr>
+          <w:sz w:val="19"/>
+        </w:rPr>
         <w:t xml:space="preserve"> — Rowan University</w:t>
       </w:r>
     </w:p>
     <w:p>
       <w:pPr>
         <w:pStyle w:val="JobMeta"/>
-        <w:spacing w:before="0" w:after="0" w:line="240" w:lineRule="auto"/>
+        <w:spacing w:before="0" w:after="20" w:line="220" w:lineRule="exact"/>
       </w:pPr>
       <w:r>
+        <w:rPr>
+          <w:sz w:val="19"/>
+        </w:rPr>
         <w:t>2018 - 2020</w:t>
       </w:r>
     </w:p>
     <w:p>
       <w:pPr>
         <w:pStyle w:val="ListBullet"/>
-        <w:spacing w:before="0" w:after="0" w:line="240" w:lineRule="auto"/>
+        <w:spacing w:before="0" w:after="20" w:line="230" w:lineRule="exact"/>
       </w:pPr>
       <w:r>
+        <w:rPr>
+          <w:sz w:val="19"/>
+        </w:rPr>
         <w:t>Operated and maintained lighting, sound, and life-safety systems across 20+ live productions, troubleshooting failures under show-time pressure.</w:t>
       </w:r>
     </w:p>
     <w:p>
       <w:pPr>
         <w:pStyle w:val="ListBullet"/>
-        <w:spacing w:before="0" w:after="0" w:line="240" w:lineRule="auto"/>
+        <w:spacing w:before="0" w:after="20" w:line="230" w:lineRule="exact"/>
       </w:pPr>
       <w:r>
+        <w:rPr>
+          <w:sz w:val="19"/>
+        </w:rPr>
         <w:t>Coordinated setup and teardown with student and faculty crews for rehearsals, performances, and campus events.</w:t>
       </w:r>
     </w:p>
     <w:p>
       <w:pPr>
         <w:pStyle w:val="JobTitle"/>
-        <w:spacing w:before="0" w:after="0" w:line="240" w:lineRule="auto"/>
+        <w:spacing w:before="0" w:after="40" w:line="230" w:lineRule="exact"/>
       </w:pPr>
       <w:r>
+        <w:rPr>
+          <w:sz w:val="19"/>
+        </w:rPr>
         <w:t>IT Help Desk Technician &amp; Media Services Specialist</w:t>
       </w:r>
       <w:r>
+        <w:rPr>
+          <w:sz w:val="19"/>
+        </w:rPr>
         <w:t xml:space="preserve"> — Southern New Hampshire University</w:t>
       </w:r>
     </w:p>
     <w:p>
       <w:pPr>
         <w:pStyle w:val="JobMeta"/>
-        <w:spacing w:before="0" w:after="0" w:line="240" w:lineRule="auto"/>
+        <w:spacing w:before="0" w:after="20" w:line="220" w:lineRule="exact"/>
       </w:pPr>
       <w:r>
+        <w:rPr>
+          <w:sz w:val="19"/>
+        </w:rPr>
         <w:t>2016 - 2018</w:t>
       </w:r>
     </w:p>
     <w:p>
       <w:pPr>
         <w:pStyle w:val="ListBullet"/>
-        <w:spacing w:before="0" w:after="0" w:line="240" w:lineRule="auto"/>
+        <w:spacing w:before="0" w:after="20" w:line="230" w:lineRule="exact"/>
       </w:pPr>
       <w:r>
+        <w:rPr>
+          <w:sz w:val="19"/>
+        </w:rPr>
         <w:t>Delivered Tier 1/2 support to 200+ users: malware removal, security policy enforcement, hardware/software triage, and account administration.</w:t>
       </w:r>
     </w:p>
     <w:p>
       <w:pPr>
         <w:pStyle w:val="ListBullet"/>
-        <w:spacing w:before="0" w:after="0" w:line="240" w:lineRule="auto"/>
+        <w:spacing w:before="0" w:after="20" w:line="230" w:lineRule="exact"/>
       </w:pPr>
       <w:r>
+        <w:rPr>
+          <w:sz w:val="19"/>
+        </w:rPr>
         <w:t>Maintained classroom and AV technology across campus, supporting lectures, media playback, and hybrid events.</w:t>
       </w:r>
     </w:p>
     <w:p>
       <w:pPr>
         <w:pStyle w:val="SectionHeader"/>
+        <w:spacing w:before="120" w:after="40" w:line="260" w:lineRule="exact"/>
       </w:pPr>
       <w:r>
+        <w:rPr>
+          <w:sz w:val="22"/>
+        </w:rPr>
         <w:t>PROJECTS</w:t>
       </w:r>
     </w:p>
     <w:p>
+      <w:pPr>
+        <w:spacing w:before="0" w:after="40" w:line="230" w:lineRule="exact"/>
+      </w:pPr>
       <w:r>
+        <w:rPr>
+          <w:sz w:val="19"/>
+        </w:rPr>
         <w:t>OSINT Fraud Network Investigation — Independent</w:t>
       </w:r>
     </w:p>
     <w:p>
+      <w:pPr>
+        <w:spacing w:before="0" w:after="20" w:line="220" w:lineRule="exact"/>
+      </w:pPr>
       <w:r>
+        <w:rPr>
+          <w:sz w:val="19"/>
+        </w:rPr>
         <w:t>September 2026</w:t>
       </w:r>
     </w:p>
     <w:p>
       <w:pPr>
         <w:pStyle w:val="ListBullet"/>
+        <w:spacing w:before="0" w:after="20" w:line="230" w:lineRule="exact"/>
       </w:pPr>
       <w:r>
+        <w:rPr>
+          <w:sz w:val="19"/>
+        </w:rPr>
         <w:t>Identified and dismantled a network of 15 fraudulent websites and 5 payment processors impersonating real small businesses.</w:t>
       </w:r>
     </w:p>
     <w:p>
       <w:pPr>
         <w:pStyle w:val="ListBullet"/>
+        <w:spacing w:before="0" w:after="20" w:line="230" w:lineRule="exact"/>
       </w:pPr>
       <w:r>
+        <w:rPr>
+          <w:sz w:val="19"/>
+        </w:rPr>
         <w:t>Traced the full operation to a single threat actor using WHOIS data, Burp Suite, DNS analysis, and a shared admin handle found in page source.</w:t>
       </w:r>
     </w:p>
     <w:p>
       <w:pPr>
         <w:pStyle w:val="ListBullet"/>
+        <w:spacing w:before="0" w:after="20" w:line="230" w:lineRule="exact"/>
       </w:pPr>
       <w:r>
+        <w:rPr>
+          <w:sz w:val="19"/>
+        </w:rPr>
         <w:t>Filed coordinated takedowns that took down the entire operation.</w:t>
       </w:r>
     </w:p>
     <w:p>
       <w:pPr>
         <w:pStyle w:val="SectionHeader"/>
-        <w:spacing w:before="0" w:after="0" w:line="240" w:lineRule="auto"/>
+        <w:spacing w:before="120" w:after="40" w:line="260" w:lineRule="exact"/>
       </w:pPr>
       <w:r>
+        <w:rPr>
+          <w:sz w:val="22"/>
+        </w:rPr>
         <w:t>EDUCATION</w:t>
       </w:r>
     </w:p>
     <w:p>
       <w:pPr>
         <w:pStyle w:val="Body"/>
-        <w:spacing w:before="0" w:after="0" w:line="240" w:lineRule="auto"/>
+        <w:spacing w:before="0" w:after="40" w:line="230" w:lineRule="exact"/>
       </w:pPr>
       <w:r>
         <w:rPr>
           <w:b/>
+          <w:sz w:val="19"/>
         </w:rPr>
         <w:t>B.S. Cybersecurity &amp; Information Assurance</w:t>
       </w:r>
       <w:r>
+        <w:rPr>
+          <w:sz w:val="19"/>
+        </w:rPr>
         <w:t xml:space="preserve"> — Western Governors University, August 2026</w:t>
       </w:r>
     </w:p>
     <w:sectPr>
       <w:pgSz w:w="12240" w:h="15840"/>
-      <w:pgMar w:top="720" w:right="799" w:bottom="720" w:left="799" w:header="720" w:footer="720" w:gutter="0"/>
+      <w:pgMar w:top="792" w:right="792" w:bottom="720" w:left="792" w:header="720" w:footer="720" w:gutter="0"/>
       <w:cols w:space="720"/>
       <w:docGrid w:linePitch="360"/>
     </w:sectPr>

</xml_diff>

<commit_message>
Resume matches fakeboot facts; unify title to IT & Security Administrator; Rowan+SNHU entries; reveal anchor-jump failsafe; nav-social gap; llms.txt hidden filter; CNAME for www redirect
</commit_message>
<xml_diff>
--- a/tools/Paul-Romeo-Resume.docx
+++ b/tools/Paul-Romeo-Resume.docx
@@ -279,7 +279,7 @@
         <w:rPr>
           <w:sz w:val="19"/>
         </w:rPr>
-        <w:t>Systems Administrator &amp; Security Administrator</w:t>
+        <w:t>IT &amp; Security Administrator</w:t>
       </w:r>
       <w:r>
         <w:rPr>
@@ -511,7 +511,7 @@
         <w:rPr>
           <w:sz w:val="19"/>
         </w:rPr>
-        <w:t>Identified and dismantled a network of 15 fraudulent websites and 5 payment processors impersonating real small businesses.</w:t>
+        <w:t>Identified a network of 14 fraudulent websites and 8 payment processors impersonating real small businesses.</w:t>
       </w:r>
     </w:p>
     <w:p>
@@ -523,7 +523,7 @@
         <w:rPr>
           <w:sz w:val="19"/>
         </w:rPr>
-        <w:t>Traced the full operation to a single threat actor using WHOIS data, Burp Suite, DNS analysis, and a shared admin handle found in page source.</w:t>
+        <w:t>Traced the operation to a single threat actor using WHOIS data, Burp Suite, DNS analysis, and a shared admin handle found in page source.</w:t>
       </w:r>
     </w:p>
     <w:p>
@@ -535,7 +535,7 @@
         <w:rPr>
           <w:sz w:val="19"/>
         </w:rPr>
-        <w:t>Filed coordinated takedowns that took down the entire operation.</w:t>
+        <w:t>Reported the full network to registrars, the FTC (confirmed, control on file), and Google Ads/Maps with evidence; corrections filed and takedowns in progress. Public case file: fakeboot.paulromeo.net.</w:t>
       </w:r>
     </w:p>
     <w:p>

</xml_diff>

<commit_message>
Deflate resume v3: kill unverifiable numbers, defense-framed summary/bullets, paul@paulromeo.net
</commit_message>
<xml_diff>
--- a/tools/Paul-Romeo-Resume.docx
+++ b/tools/Paul-Romeo-Resume.docx
@@ -23,7 +23,7 @@
         <w:rPr>
           <w:sz w:val="19"/>
         </w:rPr>
-        <w:t>Union, NJ  |  pauljromeo@proton.me  |  linkedin.com/in/paul-romeo  |  github.com/p-romeo</w:t>
+        <w:t>Union, NJ  |  paul@paulromeo.net  |  linkedin.com/in/paul-romeo  |  github.com/p-romeo</w:t>
       </w:r>
     </w:p>
     <w:p>
@@ -47,7 +47,7 @@
         <w:rPr>
           <w:sz w:val="19"/>
         </w:rPr>
-        <w:t>Security-focused IT professional who owns security and IT operations end-to-end for a multi-channel e-commerce company. Leads incident response and phishing/BEC investigations through to attacker-infrastructure takedowns; administers ESET EDR, UniFi networking and Protect surveillance, and TrueNAS storage. B.S. in Cybersecurity &amp; Information Assurance (WGU, August 2026) backed by nine industry certifications including Security+, CySA+, PenTest+, and ISC2 SSCP.</w:t>
+        <w:t>Security-focused IT professional who handles all security and IT for a 4-person family business. Runs phishing/BEC investigations from detection through takedown reports to registrars and hosts; administers ESET EDR, UniFi networking and Protect surveillance, and TrueNAS storage. B.S. in Cybersecurity &amp; Information Assurance (WGU, August 2026) backed by nine industry certifications including Security+, CySA+, PenTest+, and ISC2 SSCP.</w:t>
       </w:r>
     </w:p>
     <w:p>
@@ -78,7 +78,7 @@
         <w:rPr>
           <w:sz w:val="19"/>
         </w:rPr>
-        <w:t>EDR Administration (ESET EDR / Cloud Protect) | Phishing &amp; BEC Investigation | Attacker-Infrastructure Takedowns | Log Analysis | Wazuh SIEM | Duo MFA | Vulnerability Management | Endpoint Hardening | Patch Management</w:t>
+        <w:t>EDR Administration (ESET EDR / Cloud Protect) | Incident Response | Phishing &amp; BEC Investigation | Attacker-Infrastructure Takedowns | Log Analysis | Wazuh SIEM | Duo MFA | Vulnerability Management | Endpoint Hardening | Patch Management</w:t>
       </w:r>
     </w:p>
     <w:p>
@@ -97,7 +97,7 @@
         <w:rPr>
           <w:sz w:val="19"/>
         </w:rPr>
-        <w:t>UniFi Networking | VLANs &amp; Segmentation | TCP/IP, DNS, Wi-Fi | TrueNAS / SMB Storage | Backup &amp; Disaster Recovery | Windows &amp; Active Directory</w:t>
+        <w:t>UniFi Networking | VLANs &amp; Segmentation | TCP/IP, DNS, Wi-Fi | TrueNAS / SMB Storage | Backup &amp; Disaster Recovery | Windows</w:t>
       </w:r>
     </w:p>
     <w:p>
@@ -309,7 +309,7 @@
         <w:rPr>
           <w:sz w:val="19"/>
         </w:rPr>
-        <w:t>Own security and IT operations end-to-end as the company's sole internal administrator: workstations, printers, network devices, storage, and backups.</w:t>
+        <w:t>Sole IT and security person at a 4-person family business: workstations, printers, network devices, storage, and backups.</w:t>
       </w:r>
     </w:p>
     <w:p>
@@ -327,13 +327,9 @@
     <w:p>
       <w:pPr>
         <w:pStyle w:val="ListBullet"/>
-        <w:spacing w:before="0" w:after="20" w:line="230" w:lineRule="exact"/>
       </w:pPr>
       <w:r>
-        <w:rPr>
-          <w:sz w:val="19"/>
-        </w:rPr>
-        <w:t>Lead phishing and BEC incident response end-to-end, filing registrar/host/abuse-desk takedowns against live campaigns (ClickFix malware lures, BEC impersonation attempts, SSA/ScreenConnect lures, and brand-impersonation waves).</w:t>
+        <w:t>Reimage, rebuild, and harden endpoints; restore systems and files from TrueNAS backups after incidents.</w:t>
       </w:r>
     </w:p>
     <w:p>
@@ -345,7 +341,7 @@
         <w:rPr>
           <w:sz w:val="19"/>
         </w:rPr>
-        <w:t>Designed and deployed core infrastructure: a UniFi network with VLAN segmentation, a 10-camera UniFi Protect surveillance system, and TrueNAS storage with SMB shares and scheduled cloud backup.</w:t>
+        <w:t>Investigate phishing and BEC attempts — triage indicators of compromise (IOCs), then file registrar/host/abuse-desk takedowns against attacker infrastructure (ClickFix malware lures, BEC impersonation attempts, SSA/ScreenConnect lures, and brand-impersonation waves).</w:t>
       </w:r>
     </w:p>
     <w:p>
@@ -357,7 +353,19 @@
         <w:rPr>
           <w:sz w:val="19"/>
         </w:rPr>
-        <w:t>Drove e-commerce growth on BigCommerce integrated with point-of-sale: 389% sales growth and $1.2M in new revenue; cut $12K in costs through POS/e-commerce integration and added $32K/year via customer-relationship systems.</w:t>
+        <w:t>Set up the company's infrastructure: a UniFi network with VLAN segmentation, a 10-camera UniFi Protect surveillance system, and TrueNAS storage with SMB shares and scheduled cloud backup.</w:t>
+      </w:r>
+    </w:p>
+    <w:p>
+      <w:pPr>
+        <w:pStyle w:val="ListBullet"/>
+        <w:spacing w:before="0" w:after="20" w:line="230" w:lineRule="exact"/>
+      </w:pPr>
+      <w:r>
+        <w:rPr>
+          <w:sz w:val="19"/>
+        </w:rPr>
+        <w:t>Handle the company's e-commerce platform alongside IT (BigCommerce + POS integration).</w:t>
       </w:r>
     </w:p>
     <w:p>
@@ -570,6 +578,12 @@
       </w:r>
     </w:p>
     <w:sectPr>
+      <w:headerReference w:type="default" r:id="rId9"/>
+      <w:footerReference w:type="default" r:id="rId10"/>
+      <w:headerReference w:type="first" r:id="rId11"/>
+      <w:footerReference w:type="first" r:id="rId12"/>
+      <w:headerReference w:type="even" r:id="rId13"/>
+      <w:footerReference w:type="even" r:id="rId14"/>
       <w:pgSz w:w="12240" w:h="15840"/>
       <w:pgMar w:top="792" w:right="792" w:bottom="720" w:left="792" w:header="720" w:footer="720" w:gutter="0"/>
       <w:cols w:space="720"/>
@@ -577,6 +591,66 @@
     </w:sectPr>
   </w:body>
 </w:document>
+</file>
+
+<file path=word/footer1.xml><?xml version="1.0" encoding="utf-8"?>
+<w:ftr xmlns:m="http://schemas.openxmlformats.org/officeDocument/2006/math" xmlns:mc="http://schemas.openxmlformats.org/markup-compatibility/2006" xmlns:mo="http://schemas.microsoft.com/office/mac/office/2008/main" xmlns:mv="urn:schemas-microsoft-com:mac:vml" xmlns:o="urn:schemas-microsoft-com:office:office" xmlns:r="http://schemas.openxmlformats.org/officeDocument/2006/relationships" xmlns:v="urn:schemas-microsoft-com:vml" xmlns:w10="urn:schemas-microsoft-com:office:word" xmlns:w14="http://schemas.microsoft.com/office/word/2010/wordml" xmlns:w="http://schemas.openxmlformats.org/wordprocessingml/2006/main" xmlns:wne="http://schemas.microsoft.com/office/word/2006/wordml" xmlns:wp14="http://schemas.microsoft.com/office/word/2010/wordprocessingDrawing" xmlns:wp="http://schemas.openxmlformats.org/drawingml/2006/wordprocessingDrawing" xmlns:wpc="http://schemas.microsoft.com/office/word/2010/wordprocessingCanvas" xmlns:wpg="http://schemas.microsoft.com/office/word/2010/wordprocessingGroup" xmlns:wpi="http://schemas.microsoft.com/office/word/2010/wordprocessingInk" xmlns:wps="http://schemas.microsoft.com/office/word/2010/wordprocessingShape" mc:Ignorable="w14 wp14">
+  <w:p>
+    <w:pPr>
+      <w:pStyle w:val="Footer"/>
+    </w:pPr>
+  </w:p>
+</w:ftr>
+</file>
+
+<file path=word/footer2.xml><?xml version="1.0" encoding="utf-8"?>
+<w:ftr xmlns:m="http://schemas.openxmlformats.org/officeDocument/2006/math" xmlns:mc="http://schemas.openxmlformats.org/markup-compatibility/2006" xmlns:mo="http://schemas.microsoft.com/office/mac/office/2008/main" xmlns:mv="urn:schemas-microsoft-com:mac:vml" xmlns:o="urn:schemas-microsoft-com:office:office" xmlns:r="http://schemas.openxmlformats.org/officeDocument/2006/relationships" xmlns:v="urn:schemas-microsoft-com:vml" xmlns:w10="urn:schemas-microsoft-com:office:word" xmlns:w14="http://schemas.microsoft.com/office/word/2010/wordml" xmlns:w="http://schemas.openxmlformats.org/wordprocessingml/2006/main" xmlns:wne="http://schemas.microsoft.com/office/word/2006/wordml" xmlns:wp14="http://schemas.microsoft.com/office/word/2010/wordprocessingDrawing" xmlns:wp="http://schemas.openxmlformats.org/drawingml/2006/wordprocessingDrawing" xmlns:wpc="http://schemas.microsoft.com/office/word/2010/wordprocessingCanvas" xmlns:wpg="http://schemas.microsoft.com/office/word/2010/wordprocessingGroup" xmlns:wpi="http://schemas.microsoft.com/office/word/2010/wordprocessingInk" xmlns:wps="http://schemas.microsoft.com/office/word/2010/wordprocessingShape" mc:Ignorable="w14 wp14">
+  <w:p>
+    <w:pPr>
+      <w:pStyle w:val="Footer"/>
+    </w:pPr>
+  </w:p>
+</w:ftr>
+</file>
+
+<file path=word/footer3.xml><?xml version="1.0" encoding="utf-8"?>
+<w:ftr xmlns:m="http://schemas.openxmlformats.org/officeDocument/2006/math" xmlns:mc="http://schemas.openxmlformats.org/markup-compatibility/2006" xmlns:mo="http://schemas.microsoft.com/office/mac/office/2008/main" xmlns:mv="urn:schemas-microsoft-com:mac:vml" xmlns:o="urn:schemas-microsoft-com:office:office" xmlns:r="http://schemas.openxmlformats.org/officeDocument/2006/relationships" xmlns:v="urn:schemas-microsoft-com:vml" xmlns:w10="urn:schemas-microsoft-com:office:word" xmlns:w14="http://schemas.microsoft.com/office/word/2010/wordml" xmlns:w="http://schemas.openxmlformats.org/wordprocessingml/2006/main" xmlns:wne="http://schemas.microsoft.com/office/word/2006/wordml" xmlns:wp14="http://schemas.microsoft.com/office/word/2010/wordprocessingDrawing" xmlns:wp="http://schemas.openxmlformats.org/drawingml/2006/wordprocessingDrawing" xmlns:wpc="http://schemas.microsoft.com/office/word/2010/wordprocessingCanvas" xmlns:wpg="http://schemas.microsoft.com/office/word/2010/wordprocessingGroup" xmlns:wpi="http://schemas.microsoft.com/office/word/2010/wordprocessingInk" xmlns:wps="http://schemas.microsoft.com/office/word/2010/wordprocessingShape" mc:Ignorable="w14 wp14">
+  <w:p>
+    <w:pPr>
+      <w:pStyle w:val="Footer"/>
+    </w:pPr>
+  </w:p>
+</w:ftr>
+</file>
+
+<file path=word/header1.xml><?xml version="1.0" encoding="utf-8"?>
+<w:hdr xmlns:m="http://schemas.openxmlformats.org/officeDocument/2006/math" xmlns:mc="http://schemas.openxmlformats.org/markup-compatibility/2006" xmlns:mo="http://schemas.microsoft.com/office/mac/office/2008/main" xmlns:mv="urn:schemas-microsoft-com:mac:vml" xmlns:o="urn:schemas-microsoft-com:office:office" xmlns:r="http://schemas.openxmlformats.org/officeDocument/2006/relationships" xmlns:v="urn:schemas-microsoft-com:vml" xmlns:w10="urn:schemas-microsoft-com:office:word" xmlns:w14="http://schemas.microsoft.com/office/word/2010/wordml" xmlns:w="http://schemas.openxmlformats.org/wordprocessingml/2006/main" xmlns:wne="http://schemas.microsoft.com/office/word/2006/wordml" xmlns:wp14="http://schemas.microsoft.com/office/word/2010/wordprocessingDrawing" xmlns:wp="http://schemas.openxmlformats.org/drawingml/2006/wordprocessingDrawing" xmlns:wpc="http://schemas.microsoft.com/office/word/2010/wordprocessingCanvas" xmlns:wpg="http://schemas.microsoft.com/office/word/2010/wordprocessingGroup" xmlns:wpi="http://schemas.microsoft.com/office/word/2010/wordprocessingInk" xmlns:wps="http://schemas.microsoft.com/office/word/2010/wordprocessingShape" mc:Ignorable="w14 wp14">
+  <w:p>
+    <w:pPr>
+      <w:pStyle w:val="Header"/>
+    </w:pPr>
+  </w:p>
+</w:hdr>
+</file>
+
+<file path=word/header2.xml><?xml version="1.0" encoding="utf-8"?>
+<w:hdr xmlns:m="http://schemas.openxmlformats.org/officeDocument/2006/math" xmlns:mc="http://schemas.openxmlformats.org/markup-compatibility/2006" xmlns:mo="http://schemas.microsoft.com/office/mac/office/2008/main" xmlns:mv="urn:schemas-microsoft-com:mac:vml" xmlns:o="urn:schemas-microsoft-com:office:office" xmlns:r="http://schemas.openxmlformats.org/officeDocument/2006/relationships" xmlns:v="urn:schemas-microsoft-com:vml" xmlns:w10="urn:schemas-microsoft-com:office:word" xmlns:w14="http://schemas.microsoft.com/office/word/2010/wordml" xmlns:w="http://schemas.openxmlformats.org/wordprocessingml/2006/main" xmlns:wne="http://schemas.microsoft.com/office/word/2006/wordml" xmlns:wp14="http://schemas.microsoft.com/office/word/2010/wordprocessingDrawing" xmlns:wp="http://schemas.openxmlformats.org/drawingml/2006/wordprocessingDrawing" xmlns:wpc="http://schemas.microsoft.com/office/word/2010/wordprocessingCanvas" xmlns:wpg="http://schemas.microsoft.com/office/word/2010/wordprocessingGroup" xmlns:wpi="http://schemas.microsoft.com/office/word/2010/wordprocessingInk" xmlns:wps="http://schemas.microsoft.com/office/word/2010/wordprocessingShape" mc:Ignorable="w14 wp14">
+  <w:p>
+    <w:pPr>
+      <w:pStyle w:val="Header"/>
+    </w:pPr>
+  </w:p>
+</w:hdr>
+</file>
+
+<file path=word/header3.xml><?xml version="1.0" encoding="utf-8"?>
+<w:hdr xmlns:m="http://schemas.openxmlformats.org/officeDocument/2006/math" xmlns:mc="http://schemas.openxmlformats.org/markup-compatibility/2006" xmlns:mo="http://schemas.microsoft.com/office/mac/office/2008/main" xmlns:mv="urn:schemas-microsoft-com:mac:vml" xmlns:o="urn:schemas-microsoft-com:office:office" xmlns:r="http://schemas.openxmlformats.org/officeDocument/2006/relationships" xmlns:v="urn:schemas-microsoft-com:vml" xmlns:w10="urn:schemas-microsoft-com:office:word" xmlns:w14="http://schemas.microsoft.com/office/word/2010/wordml" xmlns:w="http://schemas.openxmlformats.org/wordprocessingml/2006/main" xmlns:wne="http://schemas.microsoft.com/office/word/2006/wordml" xmlns:wp14="http://schemas.microsoft.com/office/word/2010/wordprocessingDrawing" xmlns:wp="http://schemas.openxmlformats.org/drawingml/2006/wordprocessingDrawing" xmlns:wpc="http://schemas.microsoft.com/office/word/2010/wordprocessingCanvas" xmlns:wpg="http://schemas.microsoft.com/office/word/2010/wordprocessingGroup" xmlns:wpi="http://schemas.microsoft.com/office/word/2010/wordprocessingInk" xmlns:wps="http://schemas.microsoft.com/office/word/2010/wordprocessingShape" mc:Ignorable="w14 wp14">
+  <w:p>
+    <w:pPr>
+      <w:pStyle w:val="Header"/>
+    </w:pPr>
+  </w:p>
+</w:hdr>
 </file>
 
 <file path=word/numbering.xml><?xml version="1.0" encoding="utf-8"?>

</xml_diff>

<commit_message>
Resume PDF rendered from DOCX via LibreOffice (no generator); tighten DOCX metrics to one page
</commit_message>
<xml_diff>
--- a/tools/Paul-Romeo-Resume.docx
+++ b/tools/Paul-Romeo-Resume.docx
@@ -5,11 +5,11 @@
     <w:p>
       <w:pPr>
         <w:pStyle w:val="NameTitle"/>
-        <w:spacing w:before="0" w:after="40" w:line="240" w:lineRule="auto"/>
+        <w:spacing w:before="0" w:after="10" w:line="240" w:lineRule="auto"/>
       </w:pPr>
       <w:r>
         <w:rPr>
-          <w:sz w:val="36"/>
+          <w:sz w:val="17"/>
         </w:rPr>
         <w:t>PAUL J. ROMEO</w:t>
       </w:r>
@@ -17,11 +17,11 @@
     <w:p>
       <w:pPr>
         <w:pStyle w:val="ContactLine"/>
-        <w:spacing w:before="0" w:after="40" w:line="230" w:lineRule="exact"/>
+        <w:spacing w:before="0" w:after="10" w:line="240" w:lineRule="auto"/>
       </w:pPr>
       <w:r>
         <w:rPr>
-          <w:sz w:val="19"/>
+          <w:sz w:val="17"/>
         </w:rPr>
         <w:t>Union, NJ  |  paul@paulromeo.net  |  linkedin.com/in/paul-romeo  |  github.com/p-romeo</w:t>
       </w:r>
@@ -29,11 +29,11 @@
     <w:p>
       <w:pPr>
         <w:pStyle w:val="SectionHeader"/>
-        <w:spacing w:before="120" w:after="40" w:line="260" w:lineRule="exact"/>
+        <w:spacing w:before="50" w:after="20" w:line="240" w:lineRule="auto"/>
       </w:pPr>
       <w:r>
         <w:rPr>
-          <w:sz w:val="22"/>
+          <w:sz w:val="17"/>
         </w:rPr>
         <w:t>SUMMARY</w:t>
       </w:r>
@@ -41,11 +41,11 @@
     <w:p>
       <w:pPr>
         <w:pStyle w:val="Body"/>
-        <w:spacing w:before="0" w:after="40" w:line="230" w:lineRule="exact"/>
+        <w:spacing w:before="0" w:after="10" w:line="240" w:lineRule="auto"/>
       </w:pPr>
       <w:r>
         <w:rPr>
-          <w:sz w:val="19"/>
+          <w:sz w:val="17"/>
         </w:rPr>
         <w:t>Security-focused IT professional who handles all security and IT for a 4-person family business. Runs phishing/BEC investigations from detection through takedown reports to registrars and hosts; administers ESET EDR, UniFi networking and Protect surveillance, and TrueNAS storage. B.S. in Cybersecurity &amp; Information Assurance (WGU, August 2026) backed by nine industry certifications including Security+, CySA+, PenTest+, and ISC2 SSCP.</w:t>
       </w:r>
@@ -53,11 +53,11 @@
     <w:p>
       <w:pPr>
         <w:pStyle w:val="SectionHeader"/>
-        <w:spacing w:before="120" w:after="40" w:line="260" w:lineRule="exact"/>
+        <w:spacing w:before="50" w:after="20" w:line="240" w:lineRule="auto"/>
       </w:pPr>
       <w:r>
         <w:rPr>
-          <w:sz w:val="22"/>
+          <w:sz w:val="17"/>
         </w:rPr>
         <w:t>CORE SKILLS</w:t>
       </w:r>
@@ -65,18 +65,18 @@
     <w:p>
       <w:pPr>
         <w:pStyle w:val="Body"/>
-        <w:spacing w:before="0" w:after="40" w:line="230" w:lineRule="exact"/>
+        <w:spacing w:before="0" w:after="10" w:line="240" w:lineRule="auto"/>
       </w:pPr>
       <w:r>
         <w:rPr>
           <w:b/>
-          <w:sz w:val="19"/>
+          <w:sz w:val="17"/>
         </w:rPr>
         <w:t xml:space="preserve">Security Operations: </w:t>
       </w:r>
       <w:r>
         <w:rPr>
-          <w:sz w:val="19"/>
+          <w:sz w:val="17"/>
         </w:rPr>
         <w:t>EDR Administration (ESET EDR / Cloud Protect) | Incident Response | Phishing &amp; BEC Investigation | Attacker-Infrastructure Takedowns | Log Analysis | Wazuh SIEM | Duo MFA | Vulnerability Management | Endpoint Hardening | Patch Management</w:t>
       </w:r>
@@ -84,18 +84,18 @@
     <w:p>
       <w:pPr>
         <w:pStyle w:val="Body"/>
-        <w:spacing w:before="0" w:after="40" w:line="230" w:lineRule="exact"/>
+        <w:spacing w:before="0" w:after="10" w:line="240" w:lineRule="auto"/>
       </w:pPr>
       <w:r>
         <w:rPr>
           <w:b/>
-          <w:sz w:val="19"/>
+          <w:sz w:val="17"/>
         </w:rPr>
         <w:t xml:space="preserve">Network &amp; Infrastructure: </w:t>
       </w:r>
       <w:r>
         <w:rPr>
-          <w:sz w:val="19"/>
+          <w:sz w:val="17"/>
         </w:rPr>
         <w:t>UniFi Networking | VLANs &amp; Segmentation | TCP/IP, DNS, Wi-Fi | TrueNAS / SMB Storage | Backup &amp; Disaster Recovery | Windows</w:t>
       </w:r>
@@ -103,18 +103,18 @@
     <w:p>
       <w:pPr>
         <w:pStyle w:val="Body"/>
-        <w:spacing w:before="0" w:after="40" w:line="230" w:lineRule="exact"/>
+        <w:spacing w:before="0" w:after="10" w:line="240" w:lineRule="auto"/>
       </w:pPr>
       <w:r>
         <w:rPr>
           <w:b/>
-          <w:sz w:val="19"/>
+          <w:sz w:val="17"/>
         </w:rPr>
         <w:t xml:space="preserve">Automation &amp; Tools: </w:t>
       </w:r>
       <w:r>
         <w:rPr>
-          <w:sz w:val="19"/>
+          <w:sz w:val="17"/>
         </w:rPr>
         <w:t>Python | PowerShell | Bash | Git | GitHub Actions CI/CD</w:t>
       </w:r>
@@ -122,18 +122,18 @@
     <w:p>
       <w:pPr>
         <w:pStyle w:val="Body"/>
-        <w:spacing w:before="0" w:after="40" w:line="230" w:lineRule="exact"/>
+        <w:spacing w:before="0" w:after="10" w:line="240" w:lineRule="auto"/>
       </w:pPr>
       <w:r>
         <w:rPr>
           <w:b/>
-          <w:sz w:val="19"/>
+          <w:sz w:val="17"/>
         </w:rPr>
         <w:t xml:space="preserve">Business Platforms: </w:t>
       </w:r>
       <w:r>
         <w:rPr>
-          <w:sz w:val="19"/>
+          <w:sz w:val="17"/>
         </w:rPr>
         <w:t>BigCommerce | Amazon FBA | eBay | POS Integration</w:t>
       </w:r>
@@ -141,11 +141,11 @@
     <w:p>
       <w:pPr>
         <w:pStyle w:val="SectionHeader"/>
-        <w:spacing w:before="120" w:after="40" w:line="260" w:lineRule="exact"/>
+        <w:spacing w:before="50" w:after="20" w:line="240" w:lineRule="auto"/>
       </w:pPr>
       <w:r>
         <w:rPr>
-          <w:sz w:val="22"/>
+          <w:sz w:val="17"/>
         </w:rPr>
         <w:t>CERTIFICATIONS</w:t>
       </w:r>
@@ -153,11 +153,11 @@
     <w:p>
       <w:pPr>
         <w:pStyle w:val="ListBullet"/>
-        <w:spacing w:before="0" w:after="20" w:line="230" w:lineRule="exact"/>
+        <w:spacing w:before="0" w:after="10" w:line="240" w:lineRule="auto"/>
       </w:pPr>
       <w:r>
         <w:rPr>
-          <w:sz w:val="19"/>
+          <w:sz w:val="17"/>
         </w:rPr>
         <w:t>CompTIA PenTest+ (PT0-003) — ID e3a26d1b0a1944db8e569cfa0ce20432 (Apr 2026 - Apr 2029)</w:t>
       </w:r>
@@ -165,11 +165,11 @@
     <w:p>
       <w:pPr>
         <w:pStyle w:val="ListBullet"/>
-        <w:spacing w:before="0" w:after="20" w:line="230" w:lineRule="exact"/>
+        <w:spacing w:before="0" w:after="10" w:line="240" w:lineRule="auto"/>
       </w:pPr>
       <w:r>
         <w:rPr>
-          <w:sz w:val="19"/>
+          <w:sz w:val="17"/>
         </w:rPr>
         <w:t>CompTIA CySA+ — ID RWEXWLLS9NRE5JE2 (Aug 2025 - Aug 2028)</w:t>
       </w:r>
@@ -177,11 +177,11 @@
     <w:p>
       <w:pPr>
         <w:pStyle w:val="ListBullet"/>
-        <w:spacing w:before="0" w:after="20" w:line="230" w:lineRule="exact"/>
+        <w:spacing w:before="0" w:after="10" w:line="240" w:lineRule="auto"/>
       </w:pPr>
       <w:r>
         <w:rPr>
-          <w:sz w:val="19"/>
+          <w:sz w:val="17"/>
         </w:rPr>
         <w:t>ISC2 SSCP — ID 1123939 (Jul 2025)</w:t>
       </w:r>
@@ -189,11 +189,11 @@
     <w:p>
       <w:pPr>
         <w:pStyle w:val="ListBullet"/>
-        <w:spacing w:before="0" w:after="20" w:line="230" w:lineRule="exact"/>
+        <w:spacing w:before="0" w:after="10" w:line="240" w:lineRule="auto"/>
       </w:pPr>
       <w:r>
         <w:rPr>
-          <w:sz w:val="19"/>
+          <w:sz w:val="17"/>
         </w:rPr>
         <w:t>CompTIA Project+ — ID K1MYZLGS02V415QJ (Jul 2025)</w:t>
       </w:r>
@@ -201,11 +201,11 @@
     <w:p>
       <w:pPr>
         <w:pStyle w:val="ListBullet"/>
-        <w:spacing w:before="0" w:after="20" w:line="230" w:lineRule="exact"/>
+        <w:spacing w:before="0" w:after="10" w:line="240" w:lineRule="auto"/>
       </w:pPr>
       <w:r>
         <w:rPr>
-          <w:sz w:val="19"/>
+          <w:sz w:val="17"/>
         </w:rPr>
         <w:t>LPI Linux Essentials — ID LPI000661841 (Aug 2025)</w:t>
       </w:r>
@@ -213,11 +213,11 @@
     <w:p>
       <w:pPr>
         <w:pStyle w:val="ListBullet"/>
-        <w:spacing w:before="0" w:after="20" w:line="230" w:lineRule="exact"/>
+        <w:spacing w:before="0" w:after="10" w:line="240" w:lineRule="auto"/>
       </w:pPr>
       <w:r>
         <w:rPr>
-          <w:sz w:val="19"/>
+          <w:sz w:val="17"/>
         </w:rPr>
         <w:t>CompTIA Security+ — ID 2SY3TK06GJ44Q4WQ (Jul 2024 - Jul 2027)</w:t>
       </w:r>
@@ -225,11 +225,11 @@
     <w:p>
       <w:pPr>
         <w:pStyle w:val="ListBullet"/>
-        <w:spacing w:before="0" w:after="20" w:line="230" w:lineRule="exact"/>
+        <w:spacing w:before="0" w:after="10" w:line="240" w:lineRule="auto"/>
       </w:pPr>
       <w:r>
         <w:rPr>
-          <w:sz w:val="19"/>
+          <w:sz w:val="17"/>
         </w:rPr>
         <w:t>CompTIA Network+ — ID N0BPXTXZFFV4QM3T (Jun 2024 - Jun 2027)</w:t>
       </w:r>
@@ -237,11 +237,11 @@
     <w:p>
       <w:pPr>
         <w:pStyle w:val="ListBullet"/>
-        <w:spacing w:before="0" w:after="20" w:line="230" w:lineRule="exact"/>
+        <w:spacing w:before="0" w:after="10" w:line="240" w:lineRule="auto"/>
       </w:pPr>
       <w:r>
         <w:rPr>
-          <w:sz w:val="19"/>
+          <w:sz w:val="17"/>
         </w:rPr>
         <w:t>CompTIA A+ — ID G33N7H5ZJERE1F5W (Jun 2024 - Jun 2027)</w:t>
       </w:r>
@@ -249,11 +249,11 @@
     <w:p>
       <w:pPr>
         <w:pStyle w:val="ListBullet"/>
-        <w:spacing w:before="0" w:after="20" w:line="230" w:lineRule="exact"/>
+        <w:spacing w:before="0" w:after="10" w:line="240" w:lineRule="auto"/>
       </w:pPr>
       <w:r>
         <w:rPr>
-          <w:sz w:val="19"/>
+          <w:sz w:val="17"/>
         </w:rPr>
         <w:t>ITIL 4 Foundation — ID GR671719240PR (Dec 2024 - Dec 2027)</w:t>
       </w:r>
@@ -261,11 +261,11 @@
     <w:p>
       <w:pPr>
         <w:pStyle w:val="SectionHeader"/>
-        <w:spacing w:before="120" w:after="40" w:line="260" w:lineRule="exact"/>
+        <w:spacing w:before="50" w:after="20" w:line="240" w:lineRule="auto"/>
       </w:pPr>
       <w:r>
         <w:rPr>
-          <w:sz w:val="22"/>
+          <w:sz w:val="17"/>
         </w:rPr>
         <w:t>PROFESSIONAL EXPERIENCE</w:t>
       </w:r>
@@ -273,17 +273,17 @@
     <w:p>
       <w:pPr>
         <w:pStyle w:val="JobTitle"/>
-        <w:spacing w:before="0" w:after="40" w:line="230" w:lineRule="exact"/>
+        <w:spacing w:before="0" w:after="10" w:line="240" w:lineRule="auto"/>
       </w:pPr>
       <w:r>
         <w:rPr>
-          <w:sz w:val="19"/>
+          <w:sz w:val="17"/>
         </w:rPr>
         <w:t>IT &amp; Security Administrator</w:t>
       </w:r>
       <w:r>
         <w:rPr>
-          <w:sz w:val="19"/>
+          <w:sz w:val="17"/>
         </w:rPr>
         <w:t xml:space="preserve"> — Belmont Leather Company</w:t>
       </w:r>
@@ -291,11 +291,11 @@
     <w:p>
       <w:pPr>
         <w:pStyle w:val="JobMeta"/>
-        <w:spacing w:before="0" w:after="40" w:line="230" w:lineRule="exact"/>
+        <w:spacing w:before="0" w:after="10" w:line="240" w:lineRule="auto"/>
       </w:pPr>
       <w:r>
         <w:rPr>
-          <w:sz w:val="19"/>
+          <w:sz w:val="17"/>
         </w:rPr>
         <w:t>Clifton, NJ  |  2021 - Present</w:t>
       </w:r>
@@ -303,11 +303,11 @@
     <w:p>
       <w:pPr>
         <w:pStyle w:val="ListBullet"/>
-        <w:spacing w:before="0" w:after="20" w:line="230" w:lineRule="exact"/>
+        <w:spacing w:before="0" w:after="10" w:line="240" w:lineRule="auto"/>
       </w:pPr>
       <w:r>
         <w:rPr>
-          <w:sz w:val="19"/>
+          <w:sz w:val="17"/>
         </w:rPr>
         <w:t>Sole IT and security person at a 4-person family business: workstations, printers, network devices, storage, and backups.</w:t>
       </w:r>
@@ -315,11 +315,11 @@
     <w:p>
       <w:pPr>
         <w:pStyle w:val="ListBullet"/>
-        <w:spacing w:before="0" w:after="20" w:line="230" w:lineRule="exact"/>
+        <w:spacing w:before="0" w:after="10" w:line="240" w:lineRule="auto"/>
       </w:pPr>
       <w:r>
         <w:rPr>
-          <w:sz w:val="19"/>
+          <w:sz w:val="17"/>
         </w:rPr>
         <w:t>Administer ESET EDR and ESET Cloud Protect across ~15 endpoints; built automated threat alerting, weekly CVE exposure reviews, and endpoint update management.</w:t>
       </w:r>
@@ -327,6 +327,7 @@
     <w:p>
       <w:pPr>
         <w:pStyle w:val="ListBullet"/>
+        <w:spacing w:after="10" w:line="240" w:lineRule="auto"/>
       </w:pPr>
       <w:r>
         <w:t>Reimage, rebuild, and harden endpoints; restore systems and files from TrueNAS backups after incidents.</w:t>
@@ -335,11 +336,11 @@
     <w:p>
       <w:pPr>
         <w:pStyle w:val="ListBullet"/>
-        <w:spacing w:before="0" w:after="20" w:line="230" w:lineRule="exact"/>
+        <w:spacing w:before="0" w:after="10" w:line="240" w:lineRule="auto"/>
       </w:pPr>
       <w:r>
         <w:rPr>
-          <w:sz w:val="19"/>
+          <w:sz w:val="17"/>
         </w:rPr>
         <w:t>Investigate phishing and BEC attempts — triage indicators of compromise (IOCs), then file registrar/host/abuse-desk takedowns against attacker infrastructure (ClickFix malware lures, BEC impersonation attempts, SSA/ScreenConnect lures, and brand-impersonation waves).</w:t>
       </w:r>
@@ -347,11 +348,11 @@
     <w:p>
       <w:pPr>
         <w:pStyle w:val="ListBullet"/>
-        <w:spacing w:before="0" w:after="20" w:line="230" w:lineRule="exact"/>
+        <w:spacing w:before="0" w:after="10" w:line="240" w:lineRule="auto"/>
       </w:pPr>
       <w:r>
         <w:rPr>
-          <w:sz w:val="19"/>
+          <w:sz w:val="17"/>
         </w:rPr>
         <w:t>Set up the company's infrastructure: a UniFi network with VLAN segmentation, a 10-camera UniFi Protect surveillance system, and TrueNAS storage with SMB shares and scheduled cloud backup.</w:t>
       </w:r>
@@ -359,11 +360,11 @@
     <w:p>
       <w:pPr>
         <w:pStyle w:val="ListBullet"/>
-        <w:spacing w:before="0" w:after="20" w:line="230" w:lineRule="exact"/>
+        <w:spacing w:before="0" w:after="10" w:line="240" w:lineRule="auto"/>
       </w:pPr>
       <w:r>
         <w:rPr>
-          <w:sz w:val="19"/>
+          <w:sz w:val="17"/>
         </w:rPr>
         <w:t>Handle the company's e-commerce platform alongside IT (BigCommerce + POS integration).</w:t>
       </w:r>
@@ -371,17 +372,17 @@
     <w:p>
       <w:pPr>
         <w:pStyle w:val="JobTitle"/>
-        <w:spacing w:before="0" w:after="40" w:line="230" w:lineRule="exact"/>
+        <w:spacing w:before="0" w:after="10" w:line="240" w:lineRule="auto"/>
       </w:pPr>
       <w:r>
         <w:rPr>
-          <w:sz w:val="19"/>
+          <w:sz w:val="17"/>
         </w:rPr>
         <w:t>Theater Technician (Part-time)</w:t>
       </w:r>
       <w:r>
         <w:rPr>
-          <w:sz w:val="19"/>
+          <w:sz w:val="17"/>
         </w:rPr>
         <w:t xml:space="preserve"> — Rowan University</w:t>
       </w:r>
@@ -389,11 +390,11 @@
     <w:p>
       <w:pPr>
         <w:pStyle w:val="JobMeta"/>
-        <w:spacing w:before="0" w:after="20" w:line="220" w:lineRule="exact"/>
+        <w:spacing w:before="0" w:after="10" w:line="240" w:lineRule="auto"/>
       </w:pPr>
       <w:r>
         <w:rPr>
-          <w:sz w:val="19"/>
+          <w:sz w:val="17"/>
         </w:rPr>
         <w:t>2018 - 2020</w:t>
       </w:r>
@@ -401,11 +402,11 @@
     <w:p>
       <w:pPr>
         <w:pStyle w:val="ListBullet"/>
-        <w:spacing w:before="0" w:after="20" w:line="230" w:lineRule="exact"/>
+        <w:spacing w:before="0" w:after="10" w:line="240" w:lineRule="auto"/>
       </w:pPr>
       <w:r>
         <w:rPr>
-          <w:sz w:val="19"/>
+          <w:sz w:val="17"/>
         </w:rPr>
         <w:t>Operated and maintained lighting, sound, and life-safety systems across 20+ live productions, troubleshooting failures under show-time pressure.</w:t>
       </w:r>
@@ -413,11 +414,11 @@
     <w:p>
       <w:pPr>
         <w:pStyle w:val="ListBullet"/>
-        <w:spacing w:before="0" w:after="20" w:line="230" w:lineRule="exact"/>
+        <w:spacing w:before="0" w:after="10" w:line="240" w:lineRule="auto"/>
       </w:pPr>
       <w:r>
         <w:rPr>
-          <w:sz w:val="19"/>
+          <w:sz w:val="17"/>
         </w:rPr>
         <w:t>Coordinated setup and teardown with student and faculty crews for rehearsals, performances, and campus events.</w:t>
       </w:r>
@@ -425,17 +426,17 @@
     <w:p>
       <w:pPr>
         <w:pStyle w:val="JobTitle"/>
-        <w:spacing w:before="0" w:after="40" w:line="230" w:lineRule="exact"/>
+        <w:spacing w:before="0" w:after="10" w:line="240" w:lineRule="auto"/>
       </w:pPr>
       <w:r>
         <w:rPr>
-          <w:sz w:val="19"/>
+          <w:sz w:val="17"/>
         </w:rPr>
         <w:t>IT Help Desk Technician &amp; Media Services Specialist</w:t>
       </w:r>
       <w:r>
         <w:rPr>
-          <w:sz w:val="19"/>
+          <w:sz w:val="17"/>
         </w:rPr>
         <w:t xml:space="preserve"> — Southern New Hampshire University</w:t>
       </w:r>
@@ -443,11 +444,11 @@
     <w:p>
       <w:pPr>
         <w:pStyle w:val="JobMeta"/>
-        <w:spacing w:before="0" w:after="20" w:line="220" w:lineRule="exact"/>
+        <w:spacing w:before="0" w:after="10" w:line="240" w:lineRule="auto"/>
       </w:pPr>
       <w:r>
         <w:rPr>
-          <w:sz w:val="19"/>
+          <w:sz w:val="17"/>
         </w:rPr>
         <w:t>2016 - 2018</w:t>
       </w:r>
@@ -455,11 +456,11 @@
     <w:p>
       <w:pPr>
         <w:pStyle w:val="ListBullet"/>
-        <w:spacing w:before="0" w:after="20" w:line="230" w:lineRule="exact"/>
+        <w:spacing w:before="0" w:after="10" w:line="240" w:lineRule="auto"/>
       </w:pPr>
       <w:r>
         <w:rPr>
-          <w:sz w:val="19"/>
+          <w:sz w:val="17"/>
         </w:rPr>
         <w:t>Delivered Tier 1/2 support to 200+ users: malware removal, security policy enforcement, hardware/software triage, and account administration.</w:t>
       </w:r>
@@ -467,11 +468,11 @@
     <w:p>
       <w:pPr>
         <w:pStyle w:val="ListBullet"/>
-        <w:spacing w:before="0" w:after="20" w:line="230" w:lineRule="exact"/>
+        <w:spacing w:before="0" w:after="10" w:line="240" w:lineRule="auto"/>
       </w:pPr>
       <w:r>
         <w:rPr>
-          <w:sz w:val="19"/>
+          <w:sz w:val="17"/>
         </w:rPr>
         <w:t>Maintained classroom and AV technology across campus, supporting lectures, media playback, and hybrid events.</w:t>
       </w:r>
@@ -479,33 +480,33 @@
     <w:p>
       <w:pPr>
         <w:pStyle w:val="SectionHeader"/>
-        <w:spacing w:before="120" w:after="40" w:line="260" w:lineRule="exact"/>
+        <w:spacing w:before="50" w:after="20" w:line="240" w:lineRule="auto"/>
       </w:pPr>
       <w:r>
         <w:rPr>
-          <w:sz w:val="22"/>
+          <w:sz w:val="17"/>
         </w:rPr>
         <w:t>PROJECTS</w:t>
       </w:r>
     </w:p>
     <w:p>
       <w:pPr>
-        <w:spacing w:before="0" w:after="40" w:line="230" w:lineRule="exact"/>
+        <w:spacing w:before="0" w:after="10" w:line="240" w:lineRule="auto"/>
       </w:pPr>
       <w:r>
         <w:rPr>
-          <w:sz w:val="19"/>
+          <w:sz w:val="17"/>
         </w:rPr>
         <w:t>OSINT Fraud Network Investigation — Independent</w:t>
       </w:r>
     </w:p>
     <w:p>
       <w:pPr>
-        <w:spacing w:before="0" w:after="20" w:line="220" w:lineRule="exact"/>
+        <w:spacing w:before="0" w:after="10" w:line="240" w:lineRule="auto"/>
       </w:pPr>
       <w:r>
         <w:rPr>
-          <w:sz w:val="19"/>
+          <w:sz w:val="17"/>
         </w:rPr>
         <w:t>September 2026</w:t>
       </w:r>
@@ -513,11 +514,11 @@
     <w:p>
       <w:pPr>
         <w:pStyle w:val="ListBullet"/>
-        <w:spacing w:before="0" w:after="20" w:line="230" w:lineRule="exact"/>
+        <w:spacing w:before="0" w:after="10" w:line="240" w:lineRule="auto"/>
       </w:pPr>
       <w:r>
         <w:rPr>
-          <w:sz w:val="19"/>
+          <w:sz w:val="17"/>
         </w:rPr>
         <w:t>Identified a network of 14 fraudulent websites and 8 payment processors impersonating real small businesses.</w:t>
       </w:r>
@@ -525,11 +526,11 @@
     <w:p>
       <w:pPr>
         <w:pStyle w:val="ListBullet"/>
-        <w:spacing w:before="0" w:after="20" w:line="230" w:lineRule="exact"/>
+        <w:spacing w:before="0" w:after="10" w:line="240" w:lineRule="auto"/>
       </w:pPr>
       <w:r>
         <w:rPr>
-          <w:sz w:val="19"/>
+          <w:sz w:val="17"/>
         </w:rPr>
         <w:t>Traced the operation to a single threat actor using WHOIS data, Burp Suite, DNS analysis, and a shared admin handle found in page source.</w:t>
       </w:r>
@@ -537,11 +538,11 @@
     <w:p>
       <w:pPr>
         <w:pStyle w:val="ListBullet"/>
-        <w:spacing w:before="0" w:after="20" w:line="230" w:lineRule="exact"/>
+        <w:spacing w:before="0" w:after="10" w:line="240" w:lineRule="auto"/>
       </w:pPr>
       <w:r>
         <w:rPr>
-          <w:sz w:val="19"/>
+          <w:sz w:val="17"/>
         </w:rPr>
         <w:t>Reported the full network to registrars, the FTC (confirmed, control on file), and Google Ads/Maps with evidence; corrections filed and takedowns in progress. Public case file: fakeboot.paulromeo.net.</w:t>
       </w:r>
@@ -549,11 +550,11 @@
     <w:p>
       <w:pPr>
         <w:pStyle w:val="SectionHeader"/>
-        <w:spacing w:before="120" w:after="40" w:line="260" w:lineRule="exact"/>
+        <w:spacing w:before="50" w:after="20" w:line="240" w:lineRule="auto"/>
       </w:pPr>
       <w:r>
         <w:rPr>
-          <w:sz w:val="22"/>
+          <w:sz w:val="17"/>
         </w:rPr>
         <w:t>EDUCATION</w:t>
       </w:r>
@@ -561,18 +562,18 @@
     <w:p>
       <w:pPr>
         <w:pStyle w:val="Body"/>
-        <w:spacing w:before="0" w:after="40" w:line="230" w:lineRule="exact"/>
+        <w:spacing w:before="0" w:after="10" w:line="240" w:lineRule="auto"/>
       </w:pPr>
       <w:r>
         <w:rPr>
           <w:b/>
-          <w:sz w:val="19"/>
+          <w:sz w:val="17"/>
         </w:rPr>
         <w:t>B.S. Cybersecurity &amp; Information Assurance</w:t>
       </w:r>
       <w:r>
         <w:rPr>
-          <w:sz w:val="19"/>
+          <w:sz w:val="17"/>
         </w:rPr>
         <w:t xml:space="preserve"> — Western Governors University, August 2026</w:t>
       </w:r>
@@ -585,7 +586,7 @@
       <w:headerReference w:type="even" r:id="rId13"/>
       <w:footerReference w:type="even" r:id="rId14"/>
       <w:pgSz w:w="12240" w:h="15840"/>
-      <w:pgMar w:top="792" w:right="792" w:bottom="720" w:left="792" w:header="720" w:footer="720" w:gutter="0"/>
+      <w:pgMar w:top="648" w:right="648" w:bottom="648" w:left="648" w:header="720" w:footer="720" w:gutter="0"/>
       <w:cols w:space="720"/>
       <w:docGrid w:linePitch="360"/>
     </w:sectPr>

</xml_diff>

<commit_message>
Reimage bullet: match sibling bullet formatting (regular weight, 8.5pt)
</commit_message>
<xml_diff>
--- a/tools/Paul-Romeo-Resume.docx
+++ b/tools/Paul-Romeo-Resume.docx
@@ -330,6 +330,10 @@
         <w:spacing w:after="10" w:line="240" w:lineRule="auto"/>
       </w:pPr>
       <w:r>
+        <w:rPr>
+          <w:b w:val="0"/>
+          <w:sz w:val="17"/>
+        </w:rPr>
         <w:t>Reimage, rebuild, and harden endpoints; restore systems and files from TrueNAS backups after incidents.</w:t>
       </w:r>
     </w:p>

</xml_diff>

<commit_message>
List Bullet/Normal styles declare Helvetica (was inheriting renderer default serif)
</commit_message>
<xml_diff>
--- a/tools/Paul-Romeo-Resume.docx
+++ b/tools/Paul-Romeo-Resume.docx
@@ -1024,6 +1024,9 @@
     <w:pPr>
       <w:spacing w:before="0" w:after="0" w:line="240" w:lineRule="auto"/>
     </w:pPr>
+    <w:rPr>
+      <w:rFonts w:ascii="Helvetica" w:hAnsi="Helvetica"/>
+    </w:rPr>
   </w:style>
   <w:style w:type="paragraph" w:styleId="Header">
     <w:name w:val="header"/>
@@ -1555,6 +1558,9 @@
       <w:spacing w:before="0" w:after="0" w:line="240" w:lineRule="auto"/>
       <w:contextualSpacing/>
     </w:pPr>
+    <w:rPr>
+      <w:rFonts w:ascii="Helvetica" w:hAnsi="Helvetica"/>
+    </w:rPr>
   </w:style>
   <w:style w:type="paragraph" w:styleId="ListBullet2">
     <w:name w:val="List Bullet 2"/>

</xml_diff>

<commit_message>
Resume redesign: Calibri/Carlito, bordered section headers, proper hierarchy; bump link versions
</commit_message>
<xml_diff>
--- a/tools/Paul-Romeo-Resume.docx
+++ b/tools/Paul-Romeo-Resume.docx
@@ -5,334 +5,307 @@
     <w:p>
       <w:pPr>
         <w:pStyle w:val="NameTitle"/>
-        <w:spacing w:before="0" w:after="10" w:line="240" w:lineRule="auto"/>
+        <w:spacing w:after="20"/>
       </w:pPr>
       <w:r>
-        <w:rPr>
-          <w:sz w:val="17"/>
-        </w:rPr>
+        <w:rPr/>
         <w:t>PAUL J. ROMEO</w:t>
       </w:r>
     </w:p>
     <w:p>
       <w:pPr>
         <w:pStyle w:val="ContactLine"/>
-        <w:spacing w:before="0" w:after="10" w:line="240" w:lineRule="auto"/>
+        <w:spacing w:after="100"/>
       </w:pPr>
       <w:r>
-        <w:rPr>
-          <w:sz w:val="17"/>
-        </w:rPr>
+        <w:rPr/>
         <w:t>Union, NJ  |  paul@paulromeo.net  |  linkedin.com/in/paul-romeo  |  github.com/p-romeo</w:t>
       </w:r>
     </w:p>
     <w:p>
       <w:pPr>
         <w:pStyle w:val="SectionHeader"/>
-        <w:spacing w:before="50" w:after="20" w:line="240" w:lineRule="auto"/>
+        <w:keepNext/>
+        <w:spacing w:before="120" w:after="50"/>
+        <w:pBdr>
+          <w:bottom w:val="single" w:sz="6" w:space="2" w:color="B0B7C3"/>
+        </w:pBdr>
       </w:pPr>
       <w:r>
-        <w:rPr>
-          <w:sz w:val="17"/>
-        </w:rPr>
+        <w:rPr/>
         <w:t>SUMMARY</w:t>
       </w:r>
     </w:p>
     <w:p>
       <w:pPr>
         <w:pStyle w:val="Body"/>
-        <w:spacing w:before="0" w:after="10" w:line="240" w:lineRule="auto"/>
+        <w:spacing w:after="50"/>
       </w:pPr>
       <w:r>
-        <w:rPr>
-          <w:sz w:val="17"/>
-        </w:rPr>
+        <w:rPr/>
         <w:t>Security-focused IT professional who handles all security and IT for a 4-person family business. Runs phishing/BEC investigations from detection through takedown reports to registrars and hosts; administers ESET EDR, UniFi networking and Protect surveillance, and TrueNAS storage. B.S. in Cybersecurity &amp; Information Assurance (WGU, August 2026) backed by nine industry certifications including Security+, CySA+, PenTest+, and ISC2 SSCP.</w:t>
       </w:r>
     </w:p>
     <w:p>
       <w:pPr>
         <w:pStyle w:val="SectionHeader"/>
-        <w:spacing w:before="50" w:after="20" w:line="240" w:lineRule="auto"/>
+        <w:keepNext/>
+        <w:spacing w:before="120" w:after="50"/>
+        <w:pBdr>
+          <w:bottom w:val="single" w:sz="6" w:space="2" w:color="B0B7C3"/>
+        </w:pBdr>
       </w:pPr>
       <w:r>
-        <w:rPr>
-          <w:sz w:val="17"/>
-        </w:rPr>
+        <w:rPr/>
         <w:t>CORE SKILLS</w:t>
       </w:r>
     </w:p>
     <w:p>
       <w:pPr>
         <w:pStyle w:val="Body"/>
-        <w:spacing w:before="0" w:after="10" w:line="240" w:lineRule="auto"/>
+        <w:spacing w:after="50"/>
       </w:pPr>
       <w:r>
         <w:rPr>
           <w:b/>
-          <w:sz w:val="17"/>
         </w:rPr>
         <w:t xml:space="preserve">Security Operations: </w:t>
       </w:r>
       <w:r>
-        <w:rPr>
-          <w:sz w:val="17"/>
-        </w:rPr>
+        <w:rPr/>
         <w:t>EDR Administration (ESET EDR / Cloud Protect) | Incident Response | Phishing &amp; BEC Investigation | Attacker-Infrastructure Takedowns | Log Analysis | Wazuh SIEM | Duo MFA | Vulnerability Management | Endpoint Hardening | Patch Management</w:t>
       </w:r>
     </w:p>
     <w:p>
       <w:pPr>
         <w:pStyle w:val="Body"/>
-        <w:spacing w:before="0" w:after="10" w:line="240" w:lineRule="auto"/>
+        <w:spacing w:after="50"/>
       </w:pPr>
       <w:r>
         <w:rPr>
           <w:b/>
-          <w:sz w:val="17"/>
         </w:rPr>
         <w:t xml:space="preserve">Network &amp; Infrastructure: </w:t>
       </w:r>
       <w:r>
-        <w:rPr>
-          <w:sz w:val="17"/>
-        </w:rPr>
+        <w:rPr/>
         <w:t>UniFi Networking | VLANs &amp; Segmentation | TCP/IP, DNS, Wi-Fi | TrueNAS / SMB Storage | Backup &amp; Disaster Recovery | Windows</w:t>
       </w:r>
     </w:p>
     <w:p>
       <w:pPr>
         <w:pStyle w:val="Body"/>
-        <w:spacing w:before="0" w:after="10" w:line="240" w:lineRule="auto"/>
+        <w:spacing w:after="50"/>
       </w:pPr>
       <w:r>
         <w:rPr>
           <w:b/>
-          <w:sz w:val="17"/>
         </w:rPr>
         <w:t xml:space="preserve">Automation &amp; Tools: </w:t>
       </w:r>
       <w:r>
-        <w:rPr>
-          <w:sz w:val="17"/>
-        </w:rPr>
+        <w:rPr/>
         <w:t>Python | PowerShell | Bash | Git | GitHub Actions CI/CD</w:t>
       </w:r>
     </w:p>
     <w:p>
       <w:pPr>
         <w:pStyle w:val="Body"/>
-        <w:spacing w:before="0" w:after="10" w:line="240" w:lineRule="auto"/>
+        <w:spacing w:after="50"/>
       </w:pPr>
       <w:r>
         <w:rPr>
           <w:b/>
-          <w:sz w:val="17"/>
         </w:rPr>
         <w:t xml:space="preserve">Business Platforms: </w:t>
       </w:r>
       <w:r>
-        <w:rPr>
-          <w:sz w:val="17"/>
-        </w:rPr>
+        <w:rPr/>
         <w:t>BigCommerce | Amazon FBA | eBay | POS Integration</w:t>
       </w:r>
     </w:p>
     <w:p>
       <w:pPr>
         <w:pStyle w:val="SectionHeader"/>
-        <w:spacing w:before="50" w:after="20" w:line="240" w:lineRule="auto"/>
+        <w:keepNext/>
+        <w:spacing w:before="120" w:after="50"/>
+        <w:pBdr>
+          <w:bottom w:val="single" w:sz="6" w:space="2" w:color="B0B7C3"/>
+        </w:pBdr>
       </w:pPr>
       <w:r>
-        <w:rPr>
-          <w:sz w:val="17"/>
-        </w:rPr>
+        <w:rPr/>
         <w:t>CERTIFICATIONS</w:t>
       </w:r>
     </w:p>
     <w:p>
       <w:pPr>
         <w:pStyle w:val="ListBullet"/>
-        <w:spacing w:before="0" w:after="10" w:line="240" w:lineRule="auto"/>
+        <w:spacing w:after="30"/>
+        <w:ind w:left="288" w:hanging="187"/>
       </w:pPr>
       <w:r>
-        <w:rPr>
-          <w:sz w:val="17"/>
-        </w:rPr>
+        <w:rPr/>
         <w:t>CompTIA PenTest+ (PT0-003) — ID e3a26d1b0a1944db8e569cfa0ce20432 (Apr 2026 - Apr 2029)</w:t>
       </w:r>
     </w:p>
     <w:p>
       <w:pPr>
         <w:pStyle w:val="ListBullet"/>
-        <w:spacing w:before="0" w:after="10" w:line="240" w:lineRule="auto"/>
+        <w:spacing w:after="30"/>
+        <w:ind w:left="288" w:hanging="187"/>
       </w:pPr>
       <w:r>
-        <w:rPr>
-          <w:sz w:val="17"/>
-        </w:rPr>
+        <w:rPr/>
         <w:t>CompTIA CySA+ — ID RWEXWLLS9NRE5JE2 (Aug 2025 - Aug 2028)</w:t>
       </w:r>
     </w:p>
     <w:p>
       <w:pPr>
         <w:pStyle w:val="ListBullet"/>
-        <w:spacing w:before="0" w:after="10" w:line="240" w:lineRule="auto"/>
+        <w:spacing w:after="30"/>
+        <w:ind w:left="288" w:hanging="187"/>
       </w:pPr>
       <w:r>
-        <w:rPr>
-          <w:sz w:val="17"/>
-        </w:rPr>
+        <w:rPr/>
         <w:t>ISC2 SSCP — ID 1123939 (Jul 2025)</w:t>
       </w:r>
     </w:p>
     <w:p>
       <w:pPr>
         <w:pStyle w:val="ListBullet"/>
-        <w:spacing w:before="0" w:after="10" w:line="240" w:lineRule="auto"/>
+        <w:spacing w:after="30"/>
+        <w:ind w:left="288" w:hanging="187"/>
       </w:pPr>
       <w:r>
-        <w:rPr>
-          <w:sz w:val="17"/>
-        </w:rPr>
+        <w:rPr/>
         <w:t>CompTIA Project+ — ID K1MYZLGS02V415QJ (Jul 2025)</w:t>
       </w:r>
     </w:p>
     <w:p>
       <w:pPr>
         <w:pStyle w:val="ListBullet"/>
-        <w:spacing w:before="0" w:after="10" w:line="240" w:lineRule="auto"/>
+        <w:spacing w:after="30"/>
+        <w:ind w:left="288" w:hanging="187"/>
       </w:pPr>
       <w:r>
-        <w:rPr>
-          <w:sz w:val="17"/>
-        </w:rPr>
+        <w:rPr/>
         <w:t>LPI Linux Essentials — ID LPI000661841 (Aug 2025)</w:t>
       </w:r>
     </w:p>
     <w:p>
       <w:pPr>
         <w:pStyle w:val="ListBullet"/>
-        <w:spacing w:before="0" w:after="10" w:line="240" w:lineRule="auto"/>
+        <w:spacing w:after="30"/>
+        <w:ind w:left="288" w:hanging="187"/>
       </w:pPr>
       <w:r>
-        <w:rPr>
-          <w:sz w:val="17"/>
-        </w:rPr>
+        <w:rPr/>
         <w:t>CompTIA Security+ — ID 2SY3TK06GJ44Q4WQ (Jul 2024 - Jul 2027)</w:t>
       </w:r>
     </w:p>
     <w:p>
       <w:pPr>
         <w:pStyle w:val="ListBullet"/>
-        <w:spacing w:before="0" w:after="10" w:line="240" w:lineRule="auto"/>
+        <w:spacing w:after="30"/>
+        <w:ind w:left="288" w:hanging="187"/>
       </w:pPr>
       <w:r>
-        <w:rPr>
-          <w:sz w:val="17"/>
-        </w:rPr>
+        <w:rPr/>
         <w:t>CompTIA Network+ — ID N0BPXTXZFFV4QM3T (Jun 2024 - Jun 2027)</w:t>
       </w:r>
     </w:p>
     <w:p>
       <w:pPr>
         <w:pStyle w:val="ListBullet"/>
-        <w:spacing w:before="0" w:after="10" w:line="240" w:lineRule="auto"/>
+        <w:spacing w:after="30"/>
+        <w:ind w:left="288" w:hanging="187"/>
       </w:pPr>
       <w:r>
-        <w:rPr>
-          <w:sz w:val="17"/>
-        </w:rPr>
+        <w:rPr/>
         <w:t>CompTIA A+ — ID G33N7H5ZJERE1F5W (Jun 2024 - Jun 2027)</w:t>
       </w:r>
     </w:p>
     <w:p>
       <w:pPr>
         <w:pStyle w:val="ListBullet"/>
-        <w:spacing w:before="0" w:after="10" w:line="240" w:lineRule="auto"/>
+        <w:spacing w:after="30"/>
+        <w:ind w:left="288" w:hanging="187"/>
       </w:pPr>
       <w:r>
-        <w:rPr>
-          <w:sz w:val="17"/>
-        </w:rPr>
+        <w:rPr/>
         <w:t>ITIL 4 Foundation — ID GR671719240PR (Dec 2024 - Dec 2027)</w:t>
       </w:r>
     </w:p>
     <w:p>
       <w:pPr>
         <w:pStyle w:val="SectionHeader"/>
-        <w:spacing w:before="50" w:after="20" w:line="240" w:lineRule="auto"/>
+        <w:keepNext/>
+        <w:spacing w:before="120" w:after="50"/>
+        <w:pBdr>
+          <w:bottom w:val="single" w:sz="6" w:space="2" w:color="B0B7C3"/>
+        </w:pBdr>
       </w:pPr>
       <w:r>
-        <w:rPr>
-          <w:sz w:val="17"/>
-        </w:rPr>
+        <w:rPr/>
         <w:t>PROFESSIONAL EXPERIENCE</w:t>
       </w:r>
     </w:p>
     <w:p>
       <w:pPr>
         <w:pStyle w:val="JobTitle"/>
-        <w:spacing w:before="0" w:after="10" w:line="240" w:lineRule="auto"/>
+        <w:spacing/>
       </w:pPr>
       <w:r>
-        <w:rPr>
-          <w:sz w:val="17"/>
-        </w:rPr>
+        <w:rPr/>
         <w:t>IT &amp; Security Administrator</w:t>
       </w:r>
       <w:r>
-        <w:rPr>
-          <w:sz w:val="17"/>
-        </w:rPr>
+        <w:rPr/>
         <w:t xml:space="preserve"> — Belmont Leather Company</w:t>
       </w:r>
     </w:p>
     <w:p>
       <w:pPr>
         <w:pStyle w:val="JobMeta"/>
-        <w:spacing w:before="0" w:after="10" w:line="240" w:lineRule="auto"/>
+        <w:spacing w:after="30"/>
       </w:pPr>
       <w:r>
-        <w:rPr>
-          <w:sz w:val="17"/>
-        </w:rPr>
+        <w:rPr/>
         <w:t>Clifton, NJ  |  2021 - Present</w:t>
       </w:r>
     </w:p>
     <w:p>
       <w:pPr>
         <w:pStyle w:val="ListBullet"/>
-        <w:spacing w:before="0" w:after="10" w:line="240" w:lineRule="auto"/>
+        <w:spacing w:after="30"/>
+        <w:ind w:left="288" w:hanging="187"/>
       </w:pPr>
       <w:r>
-        <w:rPr>
-          <w:sz w:val="17"/>
-        </w:rPr>
+        <w:rPr/>
         <w:t>Sole IT and security person at a 4-person family business: workstations, printers, network devices, storage, and backups.</w:t>
       </w:r>
     </w:p>
     <w:p>
       <w:pPr>
         <w:pStyle w:val="ListBullet"/>
-        <w:spacing w:before="0" w:after="10" w:line="240" w:lineRule="auto"/>
+        <w:spacing w:after="30"/>
+        <w:ind w:left="288" w:hanging="187"/>
       </w:pPr>
       <w:r>
-        <w:rPr>
-          <w:sz w:val="17"/>
-        </w:rPr>
+        <w:rPr/>
         <w:t>Administer ESET EDR and ESET Cloud Protect across ~15 endpoints; built automated threat alerting, weekly CVE exposure reviews, and endpoint update management.</w:t>
       </w:r>
     </w:p>
     <w:p>
       <w:pPr>
         <w:pStyle w:val="ListBullet"/>
-        <w:spacing w:after="10" w:line="240" w:lineRule="auto"/>
+        <w:spacing w:after="30"/>
+        <w:ind w:left="288" w:hanging="187"/>
       </w:pPr>
       <w:r>
         <w:rPr>
           <w:b w:val="0"/>
-          <w:sz w:val="17"/>
         </w:rPr>
         <w:t>Reimage, rebuild, and harden endpoints; restore systems and files from TrueNAS backups after incidents.</w:t>
       </w:r>
@@ -340,245 +313,220 @@
     <w:p>
       <w:pPr>
         <w:pStyle w:val="ListBullet"/>
-        <w:spacing w:before="0" w:after="10" w:line="240" w:lineRule="auto"/>
+        <w:spacing w:after="30"/>
+        <w:ind w:left="288" w:hanging="187"/>
       </w:pPr>
       <w:r>
-        <w:rPr>
-          <w:sz w:val="17"/>
-        </w:rPr>
+        <w:rPr/>
         <w:t>Investigate phishing and BEC attempts — triage indicators of compromise (IOCs), then file registrar/host/abuse-desk takedowns against attacker infrastructure (ClickFix malware lures, BEC impersonation attempts, SSA/ScreenConnect lures, and brand-impersonation waves).</w:t>
       </w:r>
     </w:p>
     <w:p>
       <w:pPr>
         <w:pStyle w:val="ListBullet"/>
-        <w:spacing w:before="0" w:after="10" w:line="240" w:lineRule="auto"/>
+        <w:spacing w:after="30"/>
+        <w:ind w:left="288" w:hanging="187"/>
       </w:pPr>
       <w:r>
-        <w:rPr>
-          <w:sz w:val="17"/>
-        </w:rPr>
+        <w:rPr/>
         <w:t>Set up the company's infrastructure: a UniFi network with VLAN segmentation, a 10-camera UniFi Protect surveillance system, and TrueNAS storage with SMB shares and scheduled cloud backup.</w:t>
       </w:r>
     </w:p>
     <w:p>
       <w:pPr>
         <w:pStyle w:val="ListBullet"/>
-        <w:spacing w:before="0" w:after="10" w:line="240" w:lineRule="auto"/>
+        <w:spacing w:after="30"/>
+        <w:ind w:left="288" w:hanging="187"/>
       </w:pPr>
       <w:r>
-        <w:rPr>
-          <w:sz w:val="17"/>
-        </w:rPr>
+        <w:rPr/>
         <w:t>Handle the company's e-commerce platform alongside IT (BigCommerce + POS integration).</w:t>
       </w:r>
     </w:p>
     <w:p>
       <w:pPr>
         <w:pStyle w:val="JobTitle"/>
-        <w:spacing w:before="0" w:after="10" w:line="240" w:lineRule="auto"/>
+        <w:spacing/>
       </w:pPr>
       <w:r>
-        <w:rPr>
-          <w:sz w:val="17"/>
-        </w:rPr>
+        <w:rPr/>
         <w:t>Theater Technician (Part-time)</w:t>
       </w:r>
       <w:r>
-        <w:rPr>
-          <w:sz w:val="17"/>
-        </w:rPr>
+        <w:rPr/>
         <w:t xml:space="preserve"> — Rowan University</w:t>
       </w:r>
     </w:p>
     <w:p>
       <w:pPr>
         <w:pStyle w:val="JobMeta"/>
-        <w:spacing w:before="0" w:after="10" w:line="240" w:lineRule="auto"/>
+        <w:spacing w:after="30"/>
       </w:pPr>
       <w:r>
-        <w:rPr>
-          <w:sz w:val="17"/>
-        </w:rPr>
+        <w:rPr/>
         <w:t>2018 - 2020</w:t>
       </w:r>
     </w:p>
     <w:p>
       <w:pPr>
         <w:pStyle w:val="ListBullet"/>
-        <w:spacing w:before="0" w:after="10" w:line="240" w:lineRule="auto"/>
+        <w:spacing w:after="30"/>
+        <w:ind w:left="288" w:hanging="187"/>
       </w:pPr>
       <w:r>
-        <w:rPr>
-          <w:sz w:val="17"/>
-        </w:rPr>
+        <w:rPr/>
         <w:t>Operated and maintained lighting, sound, and life-safety systems across 20+ live productions, troubleshooting failures under show-time pressure.</w:t>
       </w:r>
     </w:p>
     <w:p>
       <w:pPr>
         <w:pStyle w:val="ListBullet"/>
-        <w:spacing w:before="0" w:after="10" w:line="240" w:lineRule="auto"/>
+        <w:spacing w:after="30"/>
+        <w:ind w:left="288" w:hanging="187"/>
       </w:pPr>
       <w:r>
-        <w:rPr>
-          <w:sz w:val="17"/>
-        </w:rPr>
+        <w:rPr/>
         <w:t>Coordinated setup and teardown with student and faculty crews for rehearsals, performances, and campus events.</w:t>
       </w:r>
     </w:p>
     <w:p>
       <w:pPr>
         <w:pStyle w:val="JobTitle"/>
-        <w:spacing w:before="0" w:after="10" w:line="240" w:lineRule="auto"/>
+        <w:spacing/>
       </w:pPr>
       <w:r>
-        <w:rPr>
-          <w:sz w:val="17"/>
-        </w:rPr>
+        <w:rPr/>
         <w:t>IT Help Desk Technician &amp; Media Services Specialist</w:t>
       </w:r>
       <w:r>
-        <w:rPr>
-          <w:sz w:val="17"/>
-        </w:rPr>
+        <w:rPr/>
         <w:t xml:space="preserve"> — Southern New Hampshire University</w:t>
       </w:r>
     </w:p>
     <w:p>
       <w:pPr>
         <w:pStyle w:val="JobMeta"/>
-        <w:spacing w:before="0" w:after="10" w:line="240" w:lineRule="auto"/>
+        <w:spacing w:after="30"/>
       </w:pPr>
       <w:r>
-        <w:rPr>
-          <w:sz w:val="17"/>
-        </w:rPr>
+        <w:rPr/>
         <w:t>2016 - 2018</w:t>
       </w:r>
     </w:p>
     <w:p>
       <w:pPr>
         <w:pStyle w:val="ListBullet"/>
-        <w:spacing w:before="0" w:after="10" w:line="240" w:lineRule="auto"/>
+        <w:spacing w:after="30"/>
+        <w:ind w:left="288" w:hanging="187"/>
       </w:pPr>
       <w:r>
-        <w:rPr>
-          <w:sz w:val="17"/>
-        </w:rPr>
+        <w:rPr/>
         <w:t>Delivered Tier 1/2 support to 200+ users: malware removal, security policy enforcement, hardware/software triage, and account administration.</w:t>
       </w:r>
     </w:p>
     <w:p>
       <w:pPr>
         <w:pStyle w:val="ListBullet"/>
-        <w:spacing w:before="0" w:after="10" w:line="240" w:lineRule="auto"/>
+        <w:spacing w:after="30"/>
+        <w:ind w:left="288" w:hanging="187"/>
       </w:pPr>
       <w:r>
-        <w:rPr>
-          <w:sz w:val="17"/>
-        </w:rPr>
+        <w:rPr/>
         <w:t>Maintained classroom and AV technology across campus, supporting lectures, media playback, and hybrid events.</w:t>
       </w:r>
     </w:p>
     <w:p>
       <w:pPr>
         <w:pStyle w:val="SectionHeader"/>
-        <w:spacing w:before="50" w:after="20" w:line="240" w:lineRule="auto"/>
+        <w:keepNext/>
+        <w:spacing w:before="120" w:after="50"/>
+        <w:pBdr>
+          <w:bottom w:val="single" w:sz="6" w:space="2" w:color="B0B7C3"/>
+        </w:pBdr>
       </w:pPr>
       <w:r>
-        <w:rPr>
-          <w:sz w:val="17"/>
-        </w:rPr>
+        <w:rPr/>
         <w:t>PROJECTS</w:t>
       </w:r>
     </w:p>
     <w:p>
       <w:pPr>
-        <w:spacing w:before="0" w:after="10" w:line="240" w:lineRule="auto"/>
+        <w:spacing/>
       </w:pPr>
       <w:r>
-        <w:rPr>
-          <w:sz w:val="17"/>
-        </w:rPr>
+        <w:rPr/>
         <w:t>OSINT Fraud Network Investigation — Independent</w:t>
       </w:r>
     </w:p>
     <w:p>
       <w:pPr>
-        <w:spacing w:before="0" w:after="10" w:line="240" w:lineRule="auto"/>
+        <w:spacing/>
       </w:pPr>
       <w:r>
-        <w:rPr>
-          <w:sz w:val="17"/>
-        </w:rPr>
+        <w:rPr/>
         <w:t>September 2026</w:t>
       </w:r>
     </w:p>
     <w:p>
       <w:pPr>
         <w:pStyle w:val="ListBullet"/>
-        <w:spacing w:before="0" w:after="10" w:line="240" w:lineRule="auto"/>
+        <w:spacing w:after="30"/>
+        <w:ind w:left="288" w:hanging="187"/>
       </w:pPr>
       <w:r>
-        <w:rPr>
-          <w:sz w:val="17"/>
-        </w:rPr>
+        <w:rPr/>
         <w:t>Identified a network of 14 fraudulent websites and 8 payment processors impersonating real small businesses.</w:t>
       </w:r>
     </w:p>
     <w:p>
       <w:pPr>
         <w:pStyle w:val="ListBullet"/>
-        <w:spacing w:before="0" w:after="10" w:line="240" w:lineRule="auto"/>
+        <w:spacing w:after="30"/>
+        <w:ind w:left="288" w:hanging="187"/>
       </w:pPr>
       <w:r>
-        <w:rPr>
-          <w:sz w:val="17"/>
-        </w:rPr>
+        <w:rPr/>
         <w:t>Traced the operation to a single threat actor using WHOIS data, Burp Suite, DNS analysis, and a shared admin handle found in page source.</w:t>
       </w:r>
     </w:p>
     <w:p>
       <w:pPr>
         <w:pStyle w:val="ListBullet"/>
-        <w:spacing w:before="0" w:after="10" w:line="240" w:lineRule="auto"/>
+        <w:spacing w:after="30"/>
+        <w:ind w:left="288" w:hanging="187"/>
       </w:pPr>
       <w:r>
-        <w:rPr>
-          <w:sz w:val="17"/>
-        </w:rPr>
+        <w:rPr/>
         <w:t>Reported the full network to registrars, the FTC (confirmed, control on file), and Google Ads/Maps with evidence; corrections filed and takedowns in progress. Public case file: fakeboot.paulromeo.net.</w:t>
       </w:r>
     </w:p>
     <w:p>
       <w:pPr>
         <w:pStyle w:val="SectionHeader"/>
-        <w:spacing w:before="50" w:after="20" w:line="240" w:lineRule="auto"/>
+        <w:keepNext/>
+        <w:spacing w:before="120" w:after="50"/>
+        <w:pBdr>
+          <w:bottom w:val="single" w:sz="6" w:space="2" w:color="B0B7C3"/>
+        </w:pBdr>
       </w:pPr>
       <w:r>
-        <w:rPr>
-          <w:sz w:val="17"/>
-        </w:rPr>
+        <w:rPr/>
         <w:t>EDUCATION</w:t>
       </w:r>
     </w:p>
     <w:p>
       <w:pPr>
         <w:pStyle w:val="Body"/>
-        <w:spacing w:before="0" w:after="10" w:line="240" w:lineRule="auto"/>
+        <w:spacing w:after="50"/>
       </w:pPr>
       <w:r>
         <w:rPr>
           <w:b/>
-          <w:sz w:val="17"/>
         </w:rPr>
         <w:t>B.S. Cybersecurity &amp; Information Assurance</w:t>
       </w:r>
       <w:r>
-        <w:rPr>
-          <w:sz w:val="17"/>
-        </w:rPr>
+        <w:rPr/>
         <w:t xml:space="preserve"> — Western Governors University, August 2026</w:t>
       </w:r>
     </w:p>
@@ -590,7 +538,7 @@
       <w:headerReference w:type="even" r:id="rId13"/>
       <w:footerReference w:type="even" r:id="rId14"/>
       <w:pgSz w:w="12240" w:h="15840"/>
-      <w:pgMar w:top="648" w:right="648" w:bottom="648" w:left="648" w:header="720" w:footer="720" w:gutter="0"/>
+      <w:pgMar w:top="648" w:right="720" w:bottom="648" w:left="720" w:header="720" w:footer="720" w:gutter="0"/>
       <w:cols w:space="720"/>
       <w:docGrid w:linePitch="360"/>
     </w:sectPr>
@@ -1025,7 +973,8 @@
       <w:spacing w:before="0" w:after="0" w:line="240" w:lineRule="auto"/>
     </w:pPr>
     <w:rPr>
-      <w:rFonts w:ascii="Helvetica" w:hAnsi="Helvetica"/>
+      <w:rFonts w:ascii="Calibri" w:hAnsi="Calibri" w:cs="Calibri"/>
+      <w:sz w:val="17"/>
     </w:rPr>
   </w:style>
   <w:style w:type="paragraph" w:styleId="Header">
@@ -1559,7 +1508,9 @@
       <w:contextualSpacing/>
     </w:pPr>
     <w:rPr>
-      <w:rFonts w:ascii="Helvetica" w:hAnsi="Helvetica"/>
+      <w:rFonts w:ascii="Calibri" w:hAnsi="Calibri" w:cs="Calibri"/>
+      <w:color w:val="19202A"/>
+      <w:sz w:val="17"/>
     </w:rPr>
   </w:style>
   <w:style w:type="paragraph" w:styleId="ListBullet2">
@@ -12719,10 +12670,10 @@
     <w:name w:val="NameTitle"/>
     <w:basedOn w:val="Normal"/>
     <w:rPr>
-      <w:rFonts w:ascii="Helvetica" w:hAnsi="Helvetica"/>
+      <w:rFonts w:ascii="Calibri" w:hAnsi="Calibri" w:cs="Calibri"/>
       <w:b/>
       <w:color w:val="19202A"/>
-      <w:sz w:val="40"/>
+      <w:sz w:val="38"/>
     </w:rPr>
   </w:style>
   <w:style w:type="paragraph" w:customStyle="1" w:styleId="ContactLine">
@@ -12732,11 +12683,11 @@
       <w:spacing w:before="0" w:after="0" w:line="240" w:lineRule="auto"/>
     </w:pPr>
     <w:rPr>
-      <w:rFonts w:ascii="Helvetica" w:hAnsi="Helvetica"/>
+      <w:rFonts w:ascii="Calibri" w:hAnsi="Calibri" w:cs="Calibri"/>
       <w:b w:val="0"/>
       <w:i w:val="0"/>
-      <w:color w:val="464E5A"/>
-      <w:sz w:val="19"/>
+      <w:color w:val="4A5568"/>
+      <w:sz w:val="18"/>
     </w:rPr>
   </w:style>
   <w:style w:type="paragraph" w:customStyle="1" w:styleId="SectionHeader">
@@ -12746,25 +12697,25 @@
       <w:spacing w:before="0" w:after="0" w:line="240" w:lineRule="auto"/>
     </w:pPr>
     <w:rPr>
-      <w:rFonts w:ascii="Helvetica" w:hAnsi="Helvetica"/>
-      <w:b/>
-      <w:color w:val="1E4678"/>
-      <w:sz w:val="22"/>
-    </w:rPr>
-  </w:style>
-  <w:style w:type="paragraph" w:customStyle="1" w:styleId="JobTitle">
-    <w:name w:val="JobTitle"/>
-    <w:basedOn w:val="Normal"/>
-    <w:pPr>
-      <w:spacing w:before="0" w:after="0" w:line="240" w:lineRule="auto"/>
-    </w:pPr>
-    <w:rPr>
-      <w:rFonts w:ascii="Helvetica" w:hAnsi="Helvetica"/>
+      <w:rFonts w:ascii="Calibri" w:hAnsi="Calibri" w:cs="Calibri"/>
       <w:b/>
       <w:color w:val="19202A"/>
       <w:sz w:val="21"/>
     </w:rPr>
   </w:style>
+  <w:style w:type="paragraph" w:customStyle="1" w:styleId="JobTitle">
+    <w:name w:val="JobTitle"/>
+    <w:basedOn w:val="Normal"/>
+    <w:pPr>
+      <w:spacing w:before="0" w:after="0" w:line="240" w:lineRule="auto"/>
+    </w:pPr>
+    <w:rPr>
+      <w:rFonts w:ascii="Calibri" w:hAnsi="Calibri" w:cs="Calibri"/>
+      <w:b/>
+      <w:color w:val="19202A"/>
+      <w:sz w:val="20"/>
+    </w:rPr>
+  </w:style>
   <w:style w:type="paragraph" w:customStyle="1" w:styleId="JobMeta">
     <w:name w:val="JobMeta"/>
     <w:basedOn w:val="Normal"/>
@@ -12772,11 +12723,11 @@
       <w:spacing w:before="0" w:after="0" w:line="240" w:lineRule="auto"/>
     </w:pPr>
     <w:rPr>
-      <w:rFonts w:ascii="Helvetica" w:hAnsi="Helvetica"/>
+      <w:rFonts w:ascii="Calibri" w:hAnsi="Calibri" w:cs="Calibri"/>
       <w:b w:val="0"/>
       <w:i/>
-      <w:color w:val="5A626E"/>
-      <w:sz w:val="19"/>
+      <w:color w:val="4A5568"/>
+      <w:sz w:val="18"/>
     </w:rPr>
   </w:style>
   <w:style w:type="paragraph" w:customStyle="1" w:styleId="Body">
@@ -12786,10 +12737,10 @@
       <w:spacing w:before="0" w:after="0" w:line="240" w:lineRule="auto"/>
     </w:pPr>
     <w:rPr>
-      <w:rFonts w:ascii="Helvetica" w:hAnsi="Helvetica"/>
+      <w:rFonts w:ascii="Calibri" w:hAnsi="Calibri" w:cs="Calibri"/>
       <w:b w:val="0"/>
       <w:color w:val="19202A"/>
-      <w:sz w:val="19"/>
+      <w:sz w:val="17"/>
     </w:rPr>
   </w:style>
 </w:styles>

</xml_diff>

<commit_message>
Drop certification IDs (verify on request); keep names + dates
</commit_message>
<xml_diff>
--- a/tools/Paul-Romeo-Resume.docx
+++ b/tools/Paul-Romeo-Resume.docx
@@ -146,7 +146,7 @@
       </w:pPr>
       <w:r>
         <w:rPr/>
-        <w:t>CompTIA PenTest+ (PT0-003) — ID e3a26d1b0a1944db8e569cfa0ce20432 (Apr 2026 - Apr 2029)</w:t>
+        <w:t>CompTIA PenTest+ (PT0-003) (Apr 2026 - Apr 2029)</w:t>
       </w:r>
     </w:p>
     <w:p>
@@ -157,7 +157,7 @@
       </w:pPr>
       <w:r>
         <w:rPr/>
-        <w:t>CompTIA CySA+ — ID RWEXWLLS9NRE5JE2 (Aug 2025 - Aug 2028)</w:t>
+        <w:t>CompTIA CySA+ (Aug 2025 - Aug 2028)</w:t>
       </w:r>
     </w:p>
     <w:p>
@@ -168,7 +168,7 @@
       </w:pPr>
       <w:r>
         <w:rPr/>
-        <w:t>ISC2 SSCP — ID 1123939 (Jul 2025)</w:t>
+        <w:t>ISC2 SSCP (Jul 2025)</w:t>
       </w:r>
     </w:p>
     <w:p>
@@ -179,7 +179,7 @@
       </w:pPr>
       <w:r>
         <w:rPr/>
-        <w:t>CompTIA Project+ — ID K1MYZLGS02V415QJ (Jul 2025)</w:t>
+        <w:t>CompTIA Project+ (Jul 2025)</w:t>
       </w:r>
     </w:p>
     <w:p>
@@ -190,7 +190,7 @@
       </w:pPr>
       <w:r>
         <w:rPr/>
-        <w:t>LPI Linux Essentials — ID LPI000661841 (Aug 2025)</w:t>
+        <w:t>LPI Linux Essentials (Aug 2025)</w:t>
       </w:r>
     </w:p>
     <w:p>
@@ -201,7 +201,7 @@
       </w:pPr>
       <w:r>
         <w:rPr/>
-        <w:t>CompTIA Security+ — ID 2SY3TK06GJ44Q4WQ (Jul 2024 - Jul 2027)</w:t>
+        <w:t>CompTIA Security+ (Jul 2024 - Jul 2027)</w:t>
       </w:r>
     </w:p>
     <w:p>
@@ -212,7 +212,7 @@
       </w:pPr>
       <w:r>
         <w:rPr/>
-        <w:t>CompTIA Network+ — ID N0BPXTXZFFV4QM3T (Jun 2024 - Jun 2027)</w:t>
+        <w:t>CompTIA Network+ (Jun 2024 - Jun 2027)</w:t>
       </w:r>
     </w:p>
     <w:p>
@@ -223,7 +223,7 @@
       </w:pPr>
       <w:r>
         <w:rPr/>
-        <w:t>CompTIA A+ — ID G33N7H5ZJERE1F5W (Jun 2024 - Jun 2027)</w:t>
+        <w:t>CompTIA A+ (Jun 2024 - Jun 2027)</w:t>
       </w:r>
     </w:p>
     <w:p>
@@ -234,7 +234,7 @@
       </w:pPr>
       <w:r>
         <w:rPr/>
-        <w:t>ITIL 4 Foundation — ID GR671719240PR (Dec 2024 - Dec 2027)</w:t>
+        <w:t>ITIL 4 Foundation (Dec 2024 - Dec 2027)</w:t>
       </w:r>
     </w:p>
     <w:p>

</xml_diff>